<commit_message>
260630 - Sprint 07
</commit_message>
<xml_diff>
--- a/documentation/.docx/Projeto_Integrador_III_SafeMask.docx
+++ b/documentation/.docx/Projeto_Integrador_III_SafeMask.docx
@@ -566,25 +566,7 @@
         <w:t xml:space="preserve"> </w:t>
       </w:r>
       <w:r>
-        <w:t>13</w:t>
-      </w:r>
-      <w:r>
-        <w:rPr>
-          <w:spacing w:val="5"/>
-        </w:rPr>
-        <w:t xml:space="preserve"> </w:t>
-      </w:r>
-      <w:r>
-        <w:t>de</w:t>
-      </w:r>
-      <w:r>
-        <w:rPr>
-          <w:spacing w:val="5"/>
-        </w:rPr>
-        <w:t xml:space="preserve"> </w:t>
-      </w:r>
-      <w:r>
-        <w:t>abril</w:t>
+        <w:t>30 de Junho</w:t>
       </w:r>
       <w:r>
         <w:rPr>
@@ -2241,11 +2223,6 @@
               <w:spacing w:before="9"/>
               <w:ind w:left="0" w:right="55"/>
               <w:jc w:val="right"/>
-              <w:rPr>
-                <w:rFonts w:ascii="Calibri"/>
-                <w:b/>
-                <w:sz w:val="24"/>
-              </w:rPr>
             </w:pPr>
             <w:hyperlink w:anchor="_bookmark12" w:history="1">
               <w:r>
@@ -2258,6 +2235,60 @@
                 <w:t>11</w:t>
               </w:r>
             </w:hyperlink>
+          </w:p>
+        </w:tc>
+      </w:tr>
+      <w:tr>
+        <w:trPr>
+          <w:trHeight w:val="355"/>
+        </w:trPr>
+        <w:tc>
+          <w:tcPr>
+            <w:tcW w:w="4172" w:type="dxa"/>
+          </w:tcPr>
+          <w:p>
+            <w:pPr>
+              <w:pStyle w:val="TableParagraph"/>
+              <w:spacing w:before="9"/>
+              <w:ind w:left="50"/>
+            </w:pPr>
+            <w:r>
+              <w:t xml:space="preserve">     11.1. Demo do Projeto</w:t>
+            </w:r>
+          </w:p>
+        </w:tc>
+        <w:tc>
+          <w:tcPr>
+            <w:tcW w:w="3271" w:type="dxa"/>
+          </w:tcPr>
+          <w:p>
+            <w:pPr>
+              <w:pStyle w:val="TableParagraph"/>
+              <w:spacing w:before="0"/>
+              <w:ind w:left="0"/>
+              <w:rPr>
+                <w:rFonts w:ascii="Times New Roman"/>
+              </w:rPr>
+            </w:pPr>
+          </w:p>
+        </w:tc>
+        <w:tc>
+          <w:tcPr>
+            <w:tcW w:w="2307" w:type="dxa"/>
+          </w:tcPr>
+          <w:p>
+            <w:pPr>
+              <w:pStyle w:val="TableParagraph"/>
+              <w:spacing w:before="9"/>
+              <w:ind w:left="0" w:right="55"/>
+              <w:jc w:val="right"/>
+            </w:pPr>
+            <w:r>
+              <w:t>1</w:t>
+            </w:r>
+            <w:r>
+              <w:t>2</w:t>
+            </w:r>
           </w:p>
         </w:tc>
       </w:tr>
@@ -2375,6 +2406,9 @@
                 <w:sz w:val="24"/>
               </w:rPr>
             </w:pPr>
+            <w:r>
+              <w:t>1</w:t>
+            </w:r>
             <w:hyperlink w:anchor="_bookmark13" w:history="1">
               <w:r>
                 <w:rPr>
@@ -2383,7 +2417,7 @@
                   <w:spacing w:val="-5"/>
                   <w:sz w:val="24"/>
                 </w:rPr>
-                <w:t>12</w:t>
+                <w:t>3</w:t>
               </w:r>
             </w:hyperlink>
           </w:p>
@@ -2486,7 +2520,7 @@
                   <w:spacing w:val="-5"/>
                   <w:sz w:val="24"/>
                 </w:rPr>
-                <w:t>12</w:t>
+                <w:t>13</w:t>
               </w:r>
             </w:hyperlink>
           </w:p>
@@ -2589,9 +2623,12 @@
                   <w:spacing w:val="-5"/>
                   <w:sz w:val="24"/>
                 </w:rPr>
-                <w:t>12</w:t>
+                <w:t>1</w:t>
               </w:r>
             </w:hyperlink>
+            <w:r>
+              <w:t>3</w:t>
+            </w:r>
           </w:p>
         </w:tc>
       </w:tr>
@@ -2751,9 +2788,12 @@
                   <w:spacing w:val="-5"/>
                   <w:sz w:val="24"/>
                 </w:rPr>
-                <w:t>13</w:t>
+                <w:t>1</w:t>
               </w:r>
             </w:hyperlink>
+            <w:r>
+              <w:t>3</w:t>
+            </w:r>
           </w:p>
         </w:tc>
       </w:tr>
@@ -2862,6 +2902,9 @@
                 <w:sz w:val="24"/>
               </w:rPr>
             </w:pPr>
+            <w:r>
+              <w:t>1</w:t>
+            </w:r>
             <w:hyperlink w:anchor="_bookmark17" w:history="1">
               <w:r>
                 <w:rPr>
@@ -2870,7 +2913,7 @@
                   <w:spacing w:val="-5"/>
                   <w:sz w:val="24"/>
                 </w:rPr>
-                <w:t>14</w:t>
+                <w:t>4</w:t>
               </w:r>
             </w:hyperlink>
           </w:p>
@@ -2966,16 +3009,13 @@
                 <w:sz w:val="24"/>
               </w:rPr>
             </w:pPr>
-            <w:hyperlink w:anchor="_bookmark18" w:history="1">
-              <w:r>
-                <w:rPr>
-                  <w:rFonts w:ascii="Calibri"/>
-                  <w:spacing w:val="-5"/>
-                  <w:sz w:val="24"/>
-                </w:rPr>
-                <w:t>14</w:t>
-              </w:r>
-            </w:hyperlink>
+            <w:r>
+              <w:rPr>
+                <w:rFonts w:ascii="Calibri"/>
+                <w:sz w:val="24"/>
+              </w:rPr>
+              <w:t>14</w:t>
+            </w:r>
           </w:p>
         </w:tc>
       </w:tr>
@@ -3076,9 +3116,12 @@
                   <w:spacing w:val="-5"/>
                   <w:sz w:val="24"/>
                 </w:rPr>
-                <w:t>14</w:t>
+                <w:t>1</w:t>
               </w:r>
             </w:hyperlink>
+            <w:r>
+              <w:t>4</w:t>
+            </w:r>
           </w:p>
         </w:tc>
       </w:tr>
@@ -3179,9 +3222,12 @@
                   <w:spacing w:val="-5"/>
                   <w:sz w:val="24"/>
                 </w:rPr>
-                <w:t>14</w:t>
+                <w:t>1</w:t>
               </w:r>
             </w:hyperlink>
+            <w:r>
+              <w:t>5</w:t>
+            </w:r>
           </w:p>
         </w:tc>
       </w:tr>
@@ -3290,9 +3336,66 @@
                   <w:spacing w:val="-5"/>
                   <w:sz w:val="24"/>
                 </w:rPr>
-                <w:t>15</w:t>
+                <w:t>1</w:t>
               </w:r>
             </w:hyperlink>
+            <w:r>
+              <w:t>5</w:t>
+            </w:r>
+          </w:p>
+        </w:tc>
+      </w:tr>
+      <w:tr>
+        <w:trPr>
+          <w:trHeight w:val="352"/>
+        </w:trPr>
+        <w:tc>
+          <w:tcPr>
+            <w:tcW w:w="4172" w:type="dxa"/>
+          </w:tcPr>
+          <w:p>
+            <w:pPr>
+              <w:pStyle w:val="TableParagraph"/>
+              <w:spacing w:before="9"/>
+              <w:ind w:left="50"/>
+            </w:pPr>
+            <w:r>
+              <w:t>16. Links Importantes</w:t>
+            </w:r>
+          </w:p>
+        </w:tc>
+        <w:tc>
+          <w:tcPr>
+            <w:tcW w:w="3271" w:type="dxa"/>
+          </w:tcPr>
+          <w:p>
+            <w:pPr>
+              <w:pStyle w:val="TableParagraph"/>
+              <w:spacing w:before="0"/>
+              <w:ind w:left="0"/>
+              <w:rPr>
+                <w:rFonts w:ascii="Times New Roman"/>
+              </w:rPr>
+            </w:pPr>
+          </w:p>
+        </w:tc>
+        <w:tc>
+          <w:tcPr>
+            <w:tcW w:w="2307" w:type="dxa"/>
+          </w:tcPr>
+          <w:p>
+            <w:pPr>
+              <w:pStyle w:val="TableParagraph"/>
+              <w:spacing w:before="9"/>
+              <w:ind w:left="0" w:right="55"/>
+              <w:jc w:val="right"/>
+            </w:pPr>
+            <w:r>
+              <w:t>1</w:t>
+            </w:r>
+            <w:r>
+              <w:t>6</w:t>
+            </w:r>
           </w:p>
         </w:tc>
       </w:tr>
@@ -3322,7 +3425,23 @@
                   <w:b/>
                   <w:sz w:val="24"/>
                 </w:rPr>
-                <w:t>16.</w:t>
+                <w:t>1</w:t>
+              </w:r>
+              <w:r>
+                <w:rPr>
+                  <w:rFonts w:ascii="Calibri"/>
+                  <w:b/>
+                  <w:sz w:val="24"/>
+                </w:rPr>
+                <w:t>7</w:t>
+              </w:r>
+              <w:r>
+                <w:rPr>
+                  <w:rFonts w:ascii="Calibri"/>
+                  <w:b/>
+                  <w:sz w:val="24"/>
+                </w:rPr>
+                <w:t>.</w:t>
               </w:r>
               <w:r>
                 <w:rPr>
@@ -3384,9 +3503,12 @@
                   <w:spacing w:val="-5"/>
                   <w:sz w:val="24"/>
                 </w:rPr>
-                <w:t>16</w:t>
+                <w:t>1</w:t>
               </w:r>
             </w:hyperlink>
+            <w:r>
+              <w:t>6</w:t>
+            </w:r>
           </w:p>
         </w:tc>
       </w:tr>
@@ -3529,9 +3651,12 @@
                   <w:spacing w:val="-5"/>
                   <w:sz w:val="24"/>
                 </w:rPr>
-                <w:t>17</w:t>
+                <w:t>1</w:t>
               </w:r>
             </w:hyperlink>
+            <w:r>
+              <w:t>7</w:t>
+            </w:r>
           </w:p>
         </w:tc>
       </w:tr>
@@ -4076,7 +4201,7 @@
           </mc:Choice>
           <mc:Fallback>
             <w:pict>
-              <v:group w14:anchorId="4881E991" id="Group 13" o:spid="_x0000_s1026" style="position:absolute;margin-left:56.65pt;margin-top:543.1pt;width:728.65pt;height:1.95pt;z-index:15728640;mso-wrap-distance-left:0;mso-wrap-distance-right:0;mso-position-horizontal-relative:page;mso-position-vertical-relative:page" coordsize="92538,247" o:gfxdata="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">
+              <v:group w14:anchorId="2535D55F" id="Group 13" o:spid="_x0000_s1026" style="position:absolute;margin-left:56.65pt;margin-top:543.1pt;width:728.65pt;height:1.95pt;z-index:15728640;mso-wrap-distance-left:0;mso-wrap-distance-right:0;mso-position-horizontal-relative:page;mso-position-vertical-relative:page" coordsize="92538,247" o:gfxdata="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">
                 <v:shape id="Graphic 14" o:spid="_x0000_s1027" style="position:absolute;width:92506;height:215;visibility:visible;mso-wrap-style:square;v-text-anchor:top" coordsize="9250680,21590" o:gfxdata="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" path="m9250680,l,,,21590r9250680,l9250680,xe" fillcolor="#9f9f9f" stroked="f">
                   <v:path arrowok="t"/>
                 </v:shape>
@@ -5353,7 +5478,7 @@
           </mc:Choice>
           <mc:Fallback>
             <w:pict>
-              <v:group w14:anchorId="5AE5BA7C" id="Group 23" o:spid="_x0000_s1026" style="position:absolute;margin-left:56.65pt;margin-top:19.65pt;width:482.4pt;height:1.95pt;z-index:-15727616;mso-wrap-distance-left:0;mso-wrap-distance-right:0;mso-position-horizontal-relative:page" coordsize="61264,247" o:gfxdata="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">
+              <v:group w14:anchorId="63618C10" id="Group 23" o:spid="_x0000_s1026" style="position:absolute;margin-left:56.65pt;margin-top:19.65pt;width:482.4pt;height:1.95pt;z-index:-15727616;mso-wrap-distance-left:0;mso-wrap-distance-right:0;mso-position-horizontal-relative:page" coordsize="61264,247" o:gfxdata="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">
                 <v:shape id="Graphic 24" o:spid="_x0000_s1027" style="position:absolute;width:61233;height:215;visibility:visible;mso-wrap-style:square;v-text-anchor:top" coordsize="6123305,21590" o:gfxdata="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" path="m6123305,l,,,21590r6123305,l6123305,xe" fillcolor="#9f9f9f" stroked="f">
                   <v:path arrowok="t"/>
                 </v:shape>
@@ -7122,7 +7247,7 @@
           </mc:Choice>
           <mc:Fallback>
             <w:pict>
-              <v:group w14:anchorId="29AE431D" id="Group 32" o:spid="_x0000_s1026" style="position:absolute;margin-left:28.3pt;margin-top:20.3pt;width:785.3pt;height:1.95pt;z-index:-15727104;mso-wrap-distance-left:0;mso-wrap-distance-right:0;mso-position-horizontal-relative:page" coordsize="99733,247" o:gfxdata="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">
+              <v:group w14:anchorId="713A8A60" id="Group 32" o:spid="_x0000_s1026" style="position:absolute;margin-left:28.3pt;margin-top:20.3pt;width:785.3pt;height:1.95pt;z-index:-15727104;mso-wrap-distance-left:0;mso-wrap-distance-right:0;mso-position-horizontal-relative:page" coordsize="99733,247" o:gfxdata="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">
                 <v:shape id="Graphic 33" o:spid="_x0000_s1027" style="position:absolute;width:99701;height:215;visibility:visible;mso-wrap-style:square;v-text-anchor:top" coordsize="9970135,21590" o:gfxdata="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" path="m9970122,l,,,21590r9970122,l9970122,xe" fillcolor="#9f9f9f" stroked="f">
                   <v:path arrowok="t"/>
                 </v:shape>
@@ -14117,7 +14242,7 @@
           <w:sz w:val="20"/>
         </w:rPr>
         <w:drawing>
-          <wp:anchor distT="0" distB="0" distL="0" distR="0" simplePos="0" relativeHeight="487589888" behindDoc="1" locked="0" layoutInCell="1" allowOverlap="1" wp14:anchorId="78D4F27D" wp14:editId="1C67AA09">
+          <wp:anchor distT="0" distB="0" distL="0" distR="0" simplePos="0" relativeHeight="487589888" behindDoc="1" locked="0" layoutInCell="1" allowOverlap="1" wp14:anchorId="78D4F27D" wp14:editId="35EB2234">
             <wp:simplePos x="0" y="0"/>
             <wp:positionH relativeFrom="page">
               <wp:posOffset>719455</wp:posOffset>
@@ -14167,6 +14292,359 @@
         <w:rPr>
           <w:sz w:val="20"/>
         </w:rPr>
+      </w:pPr>
+    </w:p>
+    <w:p>
+      <w:pPr>
+        <w:pStyle w:val="Corpodetexto"/>
+        <w:rPr>
+          <w:sz w:val="20"/>
+        </w:rPr>
+      </w:pPr>
+    </w:p>
+    <w:p>
+      <w:pPr>
+        <w:pStyle w:val="Corpodetexto"/>
+        <w:rPr>
+          <w:sz w:val="20"/>
+        </w:rPr>
+      </w:pPr>
+    </w:p>
+    <w:p>
+      <w:pPr>
+        <w:pStyle w:val="Corpodetexto"/>
+        <w:rPr>
+          <w:sz w:val="20"/>
+        </w:rPr>
+      </w:pPr>
+    </w:p>
+    <w:p>
+      <w:pPr>
+        <w:pStyle w:val="Corpodetexto"/>
+        <w:rPr>
+          <w:sz w:val="20"/>
+        </w:rPr>
+      </w:pPr>
+    </w:p>
+    <w:p>
+      <w:pPr>
+        <w:pStyle w:val="Corpodetexto"/>
+        <w:rPr>
+          <w:sz w:val="20"/>
+        </w:rPr>
+      </w:pPr>
+    </w:p>
+    <w:p>
+      <w:pPr>
+        <w:pStyle w:val="Corpodetexto"/>
+        <w:rPr>
+          <w:sz w:val="20"/>
+        </w:rPr>
+      </w:pPr>
+    </w:p>
+    <w:p>
+      <w:pPr>
+        <w:pStyle w:val="Corpodetexto"/>
+        <w:rPr>
+          <w:sz w:val="20"/>
+        </w:rPr>
+      </w:pPr>
+    </w:p>
+    <w:p>
+      <w:pPr>
+        <w:pStyle w:val="Corpodetexto"/>
+        <w:rPr>
+          <w:sz w:val="20"/>
+        </w:rPr>
+      </w:pPr>
+    </w:p>
+    <w:p>
+      <w:pPr>
+        <w:pStyle w:val="Corpodetexto"/>
+        <w:rPr>
+          <w:sz w:val="20"/>
+        </w:rPr>
+      </w:pPr>
+    </w:p>
+    <w:p>
+      <w:pPr>
+        <w:pStyle w:val="Corpodetexto"/>
+        <w:rPr>
+          <w:sz w:val="20"/>
+        </w:rPr>
+      </w:pPr>
+    </w:p>
+    <w:p>
+      <w:pPr>
+        <w:pStyle w:val="Corpodetexto"/>
+        <w:rPr>
+          <w:sz w:val="20"/>
+        </w:rPr>
+      </w:pPr>
+    </w:p>
+    <w:p>
+      <w:pPr>
+        <w:pStyle w:val="Corpodetexto"/>
+        <w:rPr>
+          <w:sz w:val="20"/>
+        </w:rPr>
+      </w:pPr>
+    </w:p>
+    <w:p>
+      <w:pPr>
+        <w:pStyle w:val="Corpodetexto"/>
+        <w:rPr>
+          <w:sz w:val="20"/>
+        </w:rPr>
+      </w:pPr>
+    </w:p>
+    <w:p>
+      <w:pPr>
+        <w:pStyle w:val="Corpodetexto"/>
+        <w:rPr>
+          <w:sz w:val="20"/>
+        </w:rPr>
+      </w:pPr>
+    </w:p>
+    <w:p>
+      <w:pPr>
+        <w:pStyle w:val="PargrafodaLista"/>
+        <w:numPr>
+          <w:ilvl w:val="1"/>
+          <w:numId w:val="3"/>
+        </w:numPr>
+        <w:tabs>
+          <w:tab w:val="left" w:pos="1581"/>
+        </w:tabs>
+        <w:spacing w:before="1"/>
+        <w:ind w:hanging="893"/>
+        <w:rPr>
+          <w:rFonts w:ascii="Calibri" w:hAnsi="Calibri"/>
+          <w:b/>
+          <w:sz w:val="26"/>
+        </w:rPr>
+      </w:pPr>
+      <w:r>
+        <w:rPr>
+          <w:rFonts w:ascii="Arial" w:hAnsi="Arial"/>
+          <w:b/>
+          <w:sz w:val="24"/>
+        </w:rPr>
+        <w:t>Demo do Projeto</w:t>
+      </w:r>
+    </w:p>
+    <w:p>
+      <w:pPr>
+        <w:pStyle w:val="Corpodetexto"/>
+        <w:spacing w:before="105"/>
+        <w:rPr>
+          <w:rFonts w:ascii="Arial"/>
+          <w:b/>
+        </w:rPr>
+      </w:pPr>
+    </w:p>
+    <w:p>
+      <w:pPr>
+        <w:pStyle w:val="Corpodetexto"/>
+        <w:ind w:left="861"/>
+      </w:pPr>
+      <w:r>
+        <w:t>Nseguem os vídeos demonstrando o uso do SafeMask e suas funcionalidades, a demo está separada em dois vídeos, pois a integração da inteligência artificial com o sistema propriamente dito será feito no próximo semestre, na disciplina de Projeto Integrador IV.</w:t>
+      </w:r>
+    </w:p>
+    <w:p>
+      <w:pPr>
+        <w:pStyle w:val="Corpodetexto"/>
+        <w:ind w:left="861"/>
+      </w:pPr>
+    </w:p>
+    <w:p>
+      <w:pPr>
+        <w:pStyle w:val="Corpodetexto"/>
+        <w:ind w:left="861"/>
+      </w:pPr>
+      <w:r>
+        <w:t xml:space="preserve">Demo do projeto em si: </w:t>
+      </w:r>
+      <w:hyperlink r:id="rId18" w:history="1">
+        <w:r>
+          <w:rPr>
+            <w:rStyle w:val="Hyperlink"/>
+          </w:rPr>
+          <w:t>https://youtu.be/J8R8f1T-RE0?si=5BHY57IKL_eMhB7k</w:t>
+        </w:r>
+      </w:hyperlink>
+    </w:p>
+    <w:p>
+      <w:pPr>
+        <w:pStyle w:val="Corpodetexto"/>
+        <w:ind w:left="861"/>
+      </w:pPr>
+      <w:r>
+        <w:t xml:space="preserve">Demo da IA: </w:t>
+      </w:r>
+      <w:hyperlink r:id="rId19" w:history="1">
+        <w:r>
+          <w:rPr>
+            <w:rStyle w:val="Hyperlink"/>
+          </w:rPr>
+          <w:t>https://youtu.be/i9nEWI2hrqQ?si=4NWvBlMg0E7I8Usf</w:t>
+        </w:r>
+      </w:hyperlink>
+    </w:p>
+    <w:p>
+      <w:pPr>
+        <w:pStyle w:val="Corpodetexto"/>
+        <w:ind w:left="861"/>
+      </w:pPr>
+      <w:r>
+        <w:rPr>
+          <w:noProof/>
+        </w:rPr>
+        <w:drawing>
+          <wp:anchor distT="0" distB="0" distL="114300" distR="114300" simplePos="0" relativeHeight="487591936" behindDoc="0" locked="0" layoutInCell="1" allowOverlap="1" wp14:anchorId="4EE36076" wp14:editId="3D76878D">
+            <wp:simplePos x="0" y="0"/>
+            <wp:positionH relativeFrom="margin">
+              <wp:align>right</wp:align>
+            </wp:positionH>
+            <wp:positionV relativeFrom="margin">
+              <wp:posOffset>2075180</wp:posOffset>
+            </wp:positionV>
+            <wp:extent cx="6308090" cy="3428365"/>
+            <wp:effectExtent l="0" t="0" r="0" b="635"/>
+            <wp:wrapSquare wrapText="bothSides"/>
+            <wp:docPr id="48684233" name="Vídeo 57" descr="Vídeo do SafeMask   1">
+              <a:hlinkClick xmlns:a="http://schemas.openxmlformats.org/drawingml/2006/main" r:id="rId20"/>
+            </wp:docPr>
+            <wp:cNvGraphicFramePr>
+              <a:graphicFrameLocks xmlns:a="http://schemas.openxmlformats.org/drawingml/2006/main" noChangeAspect="1"/>
+            </wp:cNvGraphicFramePr>
+            <a:graphic xmlns:a="http://schemas.openxmlformats.org/drawingml/2006/main">
+              <a:graphicData uri="http://schemas.openxmlformats.org/drawingml/2006/picture">
+                <pic:pic xmlns:pic="http://schemas.openxmlformats.org/drawingml/2006/picture">
+                  <pic:nvPicPr>
+                    <pic:cNvPr id="48684233" name="Vídeo 57" descr="Vídeo do SafeMask   1">
+                      <a:hlinkClick r:id="rId20"/>
+                    </pic:cNvPr>
+                    <pic:cNvPicPr/>
+                  </pic:nvPicPr>
+                  <pic:blipFill>
+                    <a:blip r:embed="rId21">
+                      <a:extLst>
+                        <a:ext uri="{28A0092B-C50C-407E-A947-70E740481C1C}">
+                          <a14:useLocalDpi xmlns:a14="http://schemas.microsoft.com/office/drawing/2010/main" val="0"/>
+                        </a:ext>
+                        <a:ext uri="{C809E66F-F1BF-436E-b5F7-EEA9579F0CBA}">
+                          <wp15:webVideoPr xmlns:wp15="http://schemas.microsoft.com/office/word/2012/wordprocessingDrawing" embeddedHtml="&lt;iframe width=&quot;200&quot; height=&quot;113&quot; src=&quot;https://www.youtube.com/embed/J8R8f1T-RE0?feature=oembed&quot; frameborder=&quot;0&quot; allow=&quot;accelerometer; autoplay; clipboard-write; encrypted-media; gyroscope; picture-in-picture; web-share&quot; referrerpolicy=&quot;strict-origin-when-cross-origin&quot; allowfullscreen=&quot;&quot; title=&quot;Vídeo do SafeMask   1&quot; sandbox=&quot;allow-scripts allow-same-origin allow-popups&quot;&gt;&lt;/iframe&gt;" h="113" w="200"/>
+                        </a:ext>
+                      </a:extLst>
+                    </a:blip>
+                    <a:stretch>
+                      <a:fillRect/>
+                    </a:stretch>
+                  </pic:blipFill>
+                  <pic:spPr>
+                    <a:xfrm>
+                      <a:off x="0" y="0"/>
+                      <a:ext cx="6308090" cy="3428365"/>
+                    </a:xfrm>
+                    <a:prstGeom prst="rect">
+                      <a:avLst/>
+                    </a:prstGeom>
+                  </pic:spPr>
+                </pic:pic>
+              </a:graphicData>
+            </a:graphic>
+            <wp14:sizeRelH relativeFrom="margin">
+              <wp14:pctWidth>0</wp14:pctWidth>
+            </wp14:sizeRelH>
+            <wp14:sizeRelV relativeFrom="margin">
+              <wp14:pctHeight>0</wp14:pctHeight>
+            </wp14:sizeRelV>
+          </wp:anchor>
+        </w:drawing>
+      </w:r>
+    </w:p>
+    <w:p>
+      <w:pPr>
+        <w:pStyle w:val="Corpodetexto"/>
+        <w:ind w:left="861"/>
+      </w:pPr>
+      <w:r>
+        <w:rPr>
+          <w:noProof/>
+        </w:rPr>
+        <w:drawing>
+          <wp:anchor distT="0" distB="0" distL="114300" distR="114300" simplePos="0" relativeHeight="487592960" behindDoc="0" locked="0" layoutInCell="1" allowOverlap="1" wp14:anchorId="4E744767" wp14:editId="306178D8">
+            <wp:simplePos x="0" y="0"/>
+            <wp:positionH relativeFrom="margin">
+              <wp:align>right</wp:align>
+            </wp:positionH>
+            <wp:positionV relativeFrom="margin">
+              <wp:posOffset>5729462</wp:posOffset>
+            </wp:positionV>
+            <wp:extent cx="6308090" cy="3428365"/>
+            <wp:effectExtent l="0" t="0" r="0" b="635"/>
+            <wp:wrapSquare wrapText="bothSides"/>
+            <wp:docPr id="1644785882" name="Vídeo 58" descr="Vídeo do SafeMask   2   IA">
+              <a:hlinkClick xmlns:a="http://schemas.openxmlformats.org/drawingml/2006/main" r:id="rId22"/>
+            </wp:docPr>
+            <wp:cNvGraphicFramePr>
+              <a:graphicFrameLocks xmlns:a="http://schemas.openxmlformats.org/drawingml/2006/main" noChangeAspect="1"/>
+            </wp:cNvGraphicFramePr>
+            <a:graphic xmlns:a="http://schemas.openxmlformats.org/drawingml/2006/main">
+              <a:graphicData uri="http://schemas.openxmlformats.org/drawingml/2006/picture">
+                <pic:pic xmlns:pic="http://schemas.openxmlformats.org/drawingml/2006/picture">
+                  <pic:nvPicPr>
+                    <pic:cNvPr id="1644785882" name="Vídeo 58" descr="Vídeo do SafeMask   2   IA">
+                      <a:hlinkClick r:id="rId22"/>
+                    </pic:cNvPr>
+                    <pic:cNvPicPr/>
+                  </pic:nvPicPr>
+                  <pic:blipFill>
+                    <a:blip r:embed="rId23">
+                      <a:extLst>
+                        <a:ext uri="{28A0092B-C50C-407E-A947-70E740481C1C}">
+                          <a14:useLocalDpi xmlns:a14="http://schemas.microsoft.com/office/drawing/2010/main" val="0"/>
+                        </a:ext>
+                        <a:ext uri="{C809E66F-F1BF-436E-b5F7-EEA9579F0CBA}">
+                          <wp15:webVideoPr xmlns:wp15="http://schemas.microsoft.com/office/word/2012/wordprocessingDrawing" embeddedHtml="&lt;iframe width=&quot;200&quot; height=&quot;113&quot; src=&quot;https://www.youtube.com/embed/i9nEWI2hrqQ?feature=oembed&quot; frameborder=&quot;0&quot; allow=&quot;accelerometer; autoplay; clipboard-write; encrypted-media; gyroscope; picture-in-picture; web-share&quot; referrerpolicy=&quot;strict-origin-when-cross-origin&quot; allowfullscreen=&quot;&quot; title=&quot;Vídeo do SafeMask   2   IA&quot; sandbox=&quot;allow-scripts allow-same-origin allow-popups&quot;&gt;&lt;/iframe&gt;" h="113" w="200"/>
+                        </a:ext>
+                      </a:extLst>
+                    </a:blip>
+                    <a:stretch>
+                      <a:fillRect/>
+                    </a:stretch>
+                  </pic:blipFill>
+                  <pic:spPr>
+                    <a:xfrm>
+                      <a:off x="0" y="0"/>
+                      <a:ext cx="6308090" cy="3428365"/>
+                    </a:xfrm>
+                    <a:prstGeom prst="rect">
+                      <a:avLst/>
+                    </a:prstGeom>
+                  </pic:spPr>
+                </pic:pic>
+              </a:graphicData>
+            </a:graphic>
+            <wp14:sizeRelH relativeFrom="margin">
+              <wp14:pctWidth>0</wp14:pctWidth>
+            </wp14:sizeRelH>
+          </wp:anchor>
+        </w:drawing>
+      </w:r>
+    </w:p>
+    <w:p>
+      <w:pPr>
+        <w:pStyle w:val="Corpodetexto"/>
+        <w:ind w:left="861"/>
+      </w:pPr>
+    </w:p>
+    <w:p>
+      <w:pPr>
+        <w:pStyle w:val="Corpodetexto"/>
+        <w:ind w:left="861"/>
         <w:sectPr>
           <w:pgSz w:w="11910" w:h="16840"/>
           <w:pgMar w:top="1100" w:right="992" w:bottom="960" w:left="992" w:header="0" w:footer="767" w:gutter="0"/>
@@ -14192,10 +14670,6 @@
           <w:sz w:val="28"/>
         </w:rPr>
       </w:pPr>
-      <w:bookmarkStart w:id="26" w:name="12._Requisito_dos_MVPs"/>
-      <w:bookmarkStart w:id="27" w:name="_bookmark13"/>
-      <w:bookmarkEnd w:id="26"/>
-      <w:bookmarkEnd w:id="27"/>
       <w:r>
         <w:lastRenderedPageBreak/>
         <w:t>Requisito</w:t>
@@ -14250,10 +14724,10 @@
           <w:sz w:val="26"/>
         </w:rPr>
       </w:pPr>
-      <w:bookmarkStart w:id="28" w:name="12.1._Aplicativo_Móvel"/>
-      <w:bookmarkStart w:id="29" w:name="_bookmark14"/>
-      <w:bookmarkEnd w:id="28"/>
-      <w:bookmarkEnd w:id="29"/>
+      <w:bookmarkStart w:id="26" w:name="12.1._Aplicativo_Móvel"/>
+      <w:bookmarkStart w:id="27" w:name="_bookmark14"/>
+      <w:bookmarkEnd w:id="26"/>
+      <w:bookmarkEnd w:id="27"/>
       <w:r>
         <w:rPr>
           <w:rFonts w:ascii="Arial" w:hAnsi="Arial"/>
@@ -14417,10 +14891,10 @@
           <w:lang w:val="en-US"/>
         </w:rPr>
       </w:pPr>
-      <w:bookmarkStart w:id="30" w:name="12.2._Web_Application_–_Link:_https://sa"/>
-      <w:bookmarkStart w:id="31" w:name="_bookmark15"/>
-      <w:bookmarkEnd w:id="30"/>
-      <w:bookmarkEnd w:id="31"/>
+      <w:bookmarkStart w:id="28" w:name="12.2._Web_Application_–_Link:_https://sa"/>
+      <w:bookmarkStart w:id="29" w:name="_bookmark15"/>
+      <w:bookmarkEnd w:id="28"/>
+      <w:bookmarkEnd w:id="29"/>
       <w:r>
         <w:rPr>
           <w:rFonts w:ascii="Arial" w:hAnsi="Arial"/>
@@ -14483,7 +14957,7 @@
         </w:rPr>
         <w:t xml:space="preserve"> </w:t>
       </w:r>
-      <w:hyperlink r:id="rId18">
+      <w:hyperlink r:id="rId24">
         <w:r>
           <w:rPr>
             <w:color w:val="0000FF"/>
@@ -14717,10 +15191,10 @@
           <w:sz w:val="28"/>
         </w:rPr>
       </w:pPr>
-      <w:bookmarkStart w:id="32" w:name="13._Modelo_de_Dados_Backoffice"/>
-      <w:bookmarkStart w:id="33" w:name="_bookmark16"/>
-      <w:bookmarkEnd w:id="32"/>
-      <w:bookmarkEnd w:id="33"/>
+      <w:bookmarkStart w:id="30" w:name="13._Modelo_de_Dados_Backoffice"/>
+      <w:bookmarkStart w:id="31" w:name="_bookmark16"/>
+      <w:bookmarkEnd w:id="30"/>
+      <w:bookmarkEnd w:id="31"/>
       <w:r>
         <w:lastRenderedPageBreak/>
         <w:t>Modelo</w:t>
@@ -14984,7 +15458,7 @@
                     <pic:cNvPicPr/>
                   </pic:nvPicPr>
                   <pic:blipFill>
-                    <a:blip r:embed="rId19" cstate="print"/>
+                    <a:blip r:embed="rId25" cstate="print"/>
                     <a:stretch>
                       <a:fillRect/>
                     </a:stretch>
@@ -15384,7 +15858,7 @@
           </mc:Choice>
           <mc:Fallback>
             <w:pict>
-              <v:group w14:anchorId="40DFF577" id="Group 52" o:spid="_x0000_s1026" style="position:absolute;margin-left:28.3pt;margin-top:17.6pt;width:785.3pt;height:1.95pt;z-index:-15725568;mso-wrap-distance-left:0;mso-wrap-distance-right:0;mso-position-horizontal-relative:page" coordsize="99733,247" o:gfxdata="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">
+              <v:group w14:anchorId="04CE80B7" id="Group 52" o:spid="_x0000_s1026" style="position:absolute;margin-left:28.3pt;margin-top:17.6pt;width:785.3pt;height:1.95pt;z-index:-15725568;mso-wrap-distance-left:0;mso-wrap-distance-right:0;mso-position-horizontal-relative:page" coordsize="99733,247" o:gfxdata="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">
                 <v:shape id="Graphic 53" o:spid="_x0000_s1027" style="position:absolute;width:99701;height:215;visibility:visible;mso-wrap-style:square;v-text-anchor:top" coordsize="9970135,21590" o:gfxdata="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" path="m9970122,l,,,21590r9970122,l9970122,xe" fillcolor="#9f9f9f" stroked="f">
                   <v:path arrowok="t"/>
                 </v:shape>
@@ -15417,7 +15891,7 @@
           <w:sz w:val="20"/>
         </w:rPr>
         <w:sectPr>
-          <w:footerReference w:type="default" r:id="rId20"/>
+          <w:footerReference w:type="default" r:id="rId26"/>
           <w:pgSz w:w="16840" w:h="11910" w:orient="landscape"/>
           <w:pgMar w:top="1340" w:right="425" w:bottom="900" w:left="425" w:header="0" w:footer="720" w:gutter="0"/>
           <w:cols w:space="720"/>
@@ -15442,10 +15916,10 @@
           <w:sz w:val="28"/>
         </w:rPr>
       </w:pPr>
-      <w:bookmarkStart w:id="34" w:name="14._Resultados_de_Teste"/>
-      <w:bookmarkStart w:id="35" w:name="_bookmark17"/>
-      <w:bookmarkEnd w:id="34"/>
-      <w:bookmarkEnd w:id="35"/>
+      <w:bookmarkStart w:id="32" w:name="14._Resultados_de_Teste"/>
+      <w:bookmarkStart w:id="33" w:name="_bookmark17"/>
+      <w:bookmarkEnd w:id="32"/>
+      <w:bookmarkEnd w:id="33"/>
       <w:r>
         <w:lastRenderedPageBreak/>
         <w:t>Resultados</w:t>
@@ -15493,10 +15967,10 @@
           <w:sz w:val="26"/>
         </w:rPr>
       </w:pPr>
-      <w:bookmarkStart w:id="36" w:name="14.1._Testes_Internos_(equipe_de_desenvo"/>
-      <w:bookmarkStart w:id="37" w:name="_bookmark18"/>
-      <w:bookmarkEnd w:id="36"/>
-      <w:bookmarkEnd w:id="37"/>
+      <w:bookmarkStart w:id="34" w:name="14.1._Testes_Internos_(equipe_de_desenvo"/>
+      <w:bookmarkStart w:id="35" w:name="_bookmark18"/>
+      <w:bookmarkEnd w:id="34"/>
+      <w:bookmarkEnd w:id="35"/>
       <w:r>
         <w:rPr>
           <w:rFonts w:ascii="Arial"/>
@@ -16357,10 +16831,10 @@
           <w:sz w:val="26"/>
         </w:rPr>
       </w:pPr>
-      <w:bookmarkStart w:id="38" w:name="14.2._Testes_Fechados_(Equipe_de_Teste,_"/>
-      <w:bookmarkStart w:id="39" w:name="_bookmark19"/>
-      <w:bookmarkEnd w:id="38"/>
-      <w:bookmarkEnd w:id="39"/>
+      <w:bookmarkStart w:id="36" w:name="14.2._Testes_Fechados_(Equipe_de_Teste,_"/>
+      <w:bookmarkStart w:id="37" w:name="_bookmark19"/>
+      <w:bookmarkEnd w:id="36"/>
+      <w:bookmarkEnd w:id="37"/>
       <w:r>
         <w:rPr>
           <w:spacing w:val="-2"/>
@@ -17469,7 +17943,7 @@
           <w:sz w:val="24"/>
         </w:rPr>
         <w:sectPr>
-          <w:footerReference w:type="default" r:id="rId21"/>
+          <w:footerReference w:type="default" r:id="rId27"/>
           <w:pgSz w:w="11910" w:h="16840"/>
           <w:pgMar w:top="1500" w:right="992" w:bottom="960" w:left="992" w:header="0" w:footer="767" w:gutter="0"/>
           <w:pgNumType w:start="14"/>
@@ -17495,10 +17969,10 @@
           <w:lang w:val="en-US"/>
         </w:rPr>
       </w:pPr>
-      <w:bookmarkStart w:id="40" w:name="14.3._Testes_Beta_(Stakeholders)__(PI_IV"/>
-      <w:bookmarkStart w:id="41" w:name="_bookmark20"/>
-      <w:bookmarkEnd w:id="40"/>
-      <w:bookmarkEnd w:id="41"/>
+      <w:bookmarkStart w:id="38" w:name="14.3._Testes_Beta_(Stakeholders)__(PI_IV"/>
+      <w:bookmarkStart w:id="39" w:name="_bookmark20"/>
+      <w:bookmarkEnd w:id="38"/>
+      <w:bookmarkEnd w:id="39"/>
       <w:r>
         <w:rPr>
           <w:lang w:val="en-US"/>
@@ -18474,10 +18948,10 @@
           <w:sz w:val="28"/>
         </w:rPr>
       </w:pPr>
-      <w:bookmarkStart w:id="42" w:name="15._Marketing_Digital_(PI_IV)_–_A_realiz"/>
-      <w:bookmarkStart w:id="43" w:name="_bookmark21"/>
-      <w:bookmarkEnd w:id="42"/>
-      <w:bookmarkEnd w:id="43"/>
+      <w:bookmarkStart w:id="40" w:name="15._Marketing_Digital_(PI_IV)_–_A_realiz"/>
+      <w:bookmarkStart w:id="41" w:name="_bookmark21"/>
+      <w:bookmarkEnd w:id="40"/>
+      <w:bookmarkEnd w:id="41"/>
       <w:r>
         <w:t>Marketing</w:t>
       </w:r>
@@ -19277,16 +19751,16 @@
           <w:sz w:val="28"/>
         </w:rPr>
       </w:pPr>
-      <w:bookmarkStart w:id="44" w:name="16._Bibliografia"/>
-      <w:bookmarkStart w:id="45" w:name="_bookmark22"/>
-      <w:bookmarkEnd w:id="44"/>
-      <w:bookmarkEnd w:id="45"/>
+      <w:bookmarkStart w:id="42" w:name="16._Bibliografia"/>
+      <w:bookmarkStart w:id="43" w:name="_bookmark22"/>
+      <w:bookmarkEnd w:id="42"/>
+      <w:bookmarkEnd w:id="43"/>
       <w:r>
         <w:rPr>
           <w:spacing w:val="-2"/>
         </w:rPr>
         <w:lastRenderedPageBreak/>
-        <w:t>Bibliografia</w:t>
+        <w:t>Links Importantes</w:t>
       </w:r>
     </w:p>
     <w:p>
@@ -19297,6 +19771,145 @@
         <w:jc w:val="both"/>
       </w:pPr>
       <w:r>
+        <w:rPr>
+          <w:sz w:val="22"/>
+          <w:szCs w:val="22"/>
+        </w:rPr>
+        <w:t>N</w:t>
+      </w:r>
+      <w:r>
+        <w:t xml:space="preserve">esta seção estão disponíveis os principais links relacionados ao projeto </w:t>
+      </w:r>
+      <w:r>
+        <w:rPr>
+          <w:b/>
+          <w:bCs/>
+        </w:rPr>
+        <w:t>SafeMask</w:t>
+      </w:r>
+      <w:r>
+        <w:t>, facilitando o acesso aos seus recursos e repositórios.</w:t>
+      </w:r>
+    </w:p>
+    <w:p>
+      <w:pPr>
+        <w:pStyle w:val="Corpodetexto"/>
+        <w:spacing w:before="100" w:line="228" w:lineRule="auto"/>
+        <w:ind w:left="141" w:right="147"/>
+        <w:jc w:val="both"/>
+        <w:rPr>
+          <w:lang w:val="en-US"/>
+        </w:rPr>
+      </w:pPr>
+      <w:r>
+        <w:rPr>
+          <w:lang w:val="en-US"/>
+        </w:rPr>
+        <w:t xml:space="preserve">GitHub: </w:t>
+      </w:r>
+      <w:hyperlink r:id="rId28" w:history="1">
+        <w:r>
+          <w:rPr>
+            <w:rStyle w:val="Hyperlink"/>
+            <w:lang w:val="en-US"/>
+          </w:rPr>
+          <w:t>https://github.com/Safe-Mask/SafeMask</w:t>
+        </w:r>
+      </w:hyperlink>
+    </w:p>
+    <w:p>
+      <w:pPr>
+        <w:pStyle w:val="Corpodetexto"/>
+        <w:spacing w:before="100" w:line="228" w:lineRule="auto"/>
+        <w:ind w:left="141" w:right="147"/>
+        <w:jc w:val="both"/>
+      </w:pPr>
+      <w:r>
+        <w:t xml:space="preserve">Azure DevOps: </w:t>
+      </w:r>
+      <w:hyperlink r:id="rId29" w:history="1">
+        <w:r>
+          <w:rPr>
+            <w:rStyle w:val="Hyperlink"/>
+          </w:rPr>
+          <w:t>https://dev.azure.com/SafeMask/Projeto%20Integrador%20III</w:t>
+        </w:r>
+      </w:hyperlink>
+    </w:p>
+    <w:p>
+      <w:pPr>
+        <w:pStyle w:val="Corpodetexto"/>
+        <w:spacing w:before="100" w:line="228" w:lineRule="auto"/>
+        <w:ind w:left="141" w:right="147"/>
+        <w:jc w:val="both"/>
+      </w:pPr>
+    </w:p>
+    <w:p>
+      <w:pPr>
+        <w:pStyle w:val="Corpodetexto"/>
+        <w:spacing w:before="100" w:line="228" w:lineRule="auto"/>
+        <w:ind w:left="141" w:right="147"/>
+        <w:jc w:val="both"/>
+      </w:pPr>
+      <w:r>
+        <w:t>As evidências das dailies e das sprints estão localizadas dentro da pasta /documentation dentro do repositório.</w:t>
+      </w:r>
+    </w:p>
+    <w:p>
+      <w:pPr>
+        <w:pStyle w:val="Corpodetexto"/>
+        <w:spacing w:before="100" w:line="228" w:lineRule="auto"/>
+        <w:ind w:left="141" w:right="147"/>
+        <w:jc w:val="both"/>
+      </w:pPr>
+    </w:p>
+    <w:p>
+      <w:pPr>
+        <w:pStyle w:val="Corpodetexto"/>
+        <w:spacing w:line="225" w:lineRule="auto"/>
+        <w:jc w:val="both"/>
+      </w:pPr>
+    </w:p>
+    <w:p>
+      <w:pPr>
+        <w:pStyle w:val="Corpodetexto"/>
+        <w:spacing w:line="225" w:lineRule="auto"/>
+        <w:jc w:val="both"/>
+      </w:pPr>
+    </w:p>
+    <w:p>
+      <w:pPr>
+        <w:pStyle w:val="Ttulo1"/>
+        <w:numPr>
+          <w:ilvl w:val="0"/>
+          <w:numId w:val="3"/>
+        </w:numPr>
+        <w:tabs>
+          <w:tab w:val="left" w:pos="861"/>
+        </w:tabs>
+        <w:spacing w:before="36"/>
+        <w:ind w:hanging="720"/>
+        <w:jc w:val="left"/>
+        <w:rPr>
+          <w:rFonts w:ascii="Calibri"/>
+          <w:sz w:val="28"/>
+        </w:rPr>
+      </w:pPr>
+      <w:r>
+        <w:rPr>
+          <w:spacing w:val="-2"/>
+        </w:rPr>
+        <w:t>Bibliografia</w:t>
+      </w:r>
+    </w:p>
+    <w:p>
+      <w:pPr>
+        <w:pStyle w:val="Corpodetexto"/>
+        <w:spacing w:before="100" w:line="228" w:lineRule="auto"/>
+        <w:ind w:left="141" w:right="147"/>
+        <w:jc w:val="both"/>
+      </w:pPr>
+      <w:r>
         <w:t>BRASIL. Lei nº</w:t>
       </w:r>
       <w:r>
@@ -19326,7 +19939,7 @@
       <w:r>
         <w:t xml:space="preserve">Pessoais (LGPD). Brasília, DF: Presidência da República, 2018. Disponível em: </w:t>
       </w:r>
-      <w:hyperlink r:id="rId22">
+      <w:hyperlink r:id="rId30">
         <w:r>
           <w:t>https://www.planalto.gov.br/ccivil_03/_ato2015-2018/2018/lei/l13709.htm</w:t>
         </w:r>
@@ -19378,7 +19991,7 @@
       <w:r>
         <w:t xml:space="preserve">FASTAPI. FastAPI Documentation. [S. l.]: FastAPI, [2026]. Disponível em: </w:t>
       </w:r>
-      <w:hyperlink r:id="rId23">
+      <w:hyperlink r:id="rId31">
         <w:r>
           <w:t>https://fastapi.tiangolo.com/</w:t>
         </w:r>
@@ -19403,7 +20016,7 @@
       <w:r>
         <w:t xml:space="preserve">PYDANTIC. Pydantic Documentation. [S. l.]: Pydantic, [2026]. Disponível em: </w:t>
       </w:r>
-      <w:hyperlink r:id="rId24">
+      <w:hyperlink r:id="rId32">
         <w:r>
           <w:t>https://docs.pydantic.dev/</w:t>
         </w:r>
@@ -19767,7 +20380,7 @@
       <w:r>
         <w:t xml:space="preserve">Disponível em: </w:t>
       </w:r>
-      <w:hyperlink r:id="rId25">
+      <w:hyperlink r:id="rId33">
         <w:r>
           <w:t>https://docs.sqlalchemy.org/</w:t>
         </w:r>
@@ -19794,10 +20407,10 @@
         <w:spacing w:before="79"/>
         <w:ind w:left="141" w:firstLine="0"/>
       </w:pPr>
-      <w:bookmarkStart w:id="46" w:name="APÊNDICE_I_-_TECNOLOGIAS_UTILIZADAS"/>
-      <w:bookmarkStart w:id="47" w:name="_bookmark23"/>
-      <w:bookmarkEnd w:id="46"/>
-      <w:bookmarkEnd w:id="47"/>
+      <w:bookmarkStart w:id="44" w:name="APÊNDICE_I_-_TECNOLOGIAS_UTILIZADAS"/>
+      <w:bookmarkStart w:id="45" w:name="_bookmark23"/>
+      <w:bookmarkEnd w:id="44"/>
+      <w:bookmarkEnd w:id="45"/>
       <w:r>
         <w:lastRenderedPageBreak/>
         <w:t>APÊNDICE</w:t>
@@ -19840,201 +20453,6 @@
           <w:spacing w:val="-2"/>
         </w:rPr>
         <w:t>UTILIZADAS</w:t>
-      </w:r>
-    </w:p>
-    <w:p>
-      <w:pPr>
-        <w:spacing w:before="129"/>
-        <w:ind w:left="141"/>
-        <w:rPr>
-          <w:rFonts w:ascii="Arial"/>
-          <w:i/>
-          <w:sz w:val="24"/>
-        </w:rPr>
-      </w:pPr>
-      <w:r>
-        <w:rPr>
-          <w:rFonts w:ascii="Arial"/>
-          <w:i/>
-          <w:sz w:val="24"/>
-        </w:rPr>
-        <w:t>(colocar</w:t>
-      </w:r>
-      <w:r>
-        <w:rPr>
-          <w:rFonts w:ascii="Arial"/>
-          <w:i/>
-          <w:spacing w:val="-6"/>
-          <w:sz w:val="24"/>
-        </w:rPr>
-        <w:t xml:space="preserve"> </w:t>
-      </w:r>
-      <w:r>
-        <w:rPr>
-          <w:rFonts w:ascii="Arial"/>
-          <w:i/>
-          <w:sz w:val="24"/>
-        </w:rPr>
-        <w:t>o</w:t>
-      </w:r>
-      <w:r>
-        <w:rPr>
-          <w:rFonts w:ascii="Arial"/>
-          <w:i/>
-          <w:spacing w:val="-3"/>
-          <w:sz w:val="24"/>
-        </w:rPr>
-        <w:t xml:space="preserve"> </w:t>
-      </w:r>
-      <w:r>
-        <w:rPr>
-          <w:rFonts w:ascii="Arial"/>
-          <w:i/>
-          <w:sz w:val="24"/>
-        </w:rPr>
-        <w:t>link</w:t>
-      </w:r>
-      <w:r>
-        <w:rPr>
-          <w:rFonts w:ascii="Arial"/>
-          <w:i/>
-          <w:spacing w:val="-3"/>
-          <w:sz w:val="24"/>
-        </w:rPr>
-        <w:t xml:space="preserve"> </w:t>
-      </w:r>
-      <w:r>
-        <w:rPr>
-          <w:rFonts w:ascii="Arial"/>
-          <w:i/>
-          <w:sz w:val="24"/>
-        </w:rPr>
-        <w:t>das</w:t>
-      </w:r>
-      <w:r>
-        <w:rPr>
-          <w:rFonts w:ascii="Arial"/>
-          <w:i/>
-          <w:spacing w:val="-3"/>
-          <w:sz w:val="24"/>
-        </w:rPr>
-        <w:t xml:space="preserve"> </w:t>
-      </w:r>
-      <w:r>
-        <w:rPr>
-          <w:rFonts w:ascii="Arial"/>
-          <w:i/>
-          <w:sz w:val="24"/>
-        </w:rPr>
-        <w:t>ferramentas</w:t>
-      </w:r>
-      <w:r>
-        <w:rPr>
-          <w:rFonts w:ascii="Arial"/>
-          <w:i/>
-          <w:spacing w:val="-8"/>
-          <w:sz w:val="24"/>
-        </w:rPr>
-        <w:t xml:space="preserve"> </w:t>
-      </w:r>
-      <w:r>
-        <w:rPr>
-          <w:rFonts w:ascii="Arial"/>
-          <w:i/>
-          <w:sz w:val="24"/>
-        </w:rPr>
-        <w:t>e</w:t>
-      </w:r>
-      <w:r>
-        <w:rPr>
-          <w:rFonts w:ascii="Arial"/>
-          <w:i/>
-          <w:spacing w:val="-1"/>
-          <w:sz w:val="24"/>
-        </w:rPr>
-        <w:t xml:space="preserve"> </w:t>
-      </w:r>
-      <w:r>
-        <w:rPr>
-          <w:rFonts w:ascii="Arial"/>
-          <w:i/>
-          <w:sz w:val="24"/>
-        </w:rPr>
-        <w:t>acesso</w:t>
-      </w:r>
-      <w:r>
-        <w:rPr>
-          <w:rFonts w:ascii="Arial"/>
-          <w:i/>
-          <w:spacing w:val="-3"/>
-          <w:sz w:val="24"/>
-        </w:rPr>
-        <w:t xml:space="preserve"> </w:t>
-      </w:r>
-      <w:r>
-        <w:rPr>
-          <w:rFonts w:ascii="Arial"/>
-          <w:i/>
-          <w:sz w:val="24"/>
-        </w:rPr>
-        <w:t>completo</w:t>
-      </w:r>
-      <w:r>
-        <w:rPr>
-          <w:rFonts w:ascii="Arial"/>
-          <w:i/>
-          <w:spacing w:val="-3"/>
-          <w:sz w:val="24"/>
-        </w:rPr>
-        <w:t xml:space="preserve"> </w:t>
-      </w:r>
-      <w:r>
-        <w:rPr>
-          <w:rFonts w:ascii="Arial"/>
-          <w:i/>
-          <w:sz w:val="24"/>
-        </w:rPr>
-        <w:t>para</w:t>
-      </w:r>
-      <w:r>
-        <w:rPr>
-          <w:rFonts w:ascii="Arial"/>
-          <w:i/>
-          <w:spacing w:val="6"/>
-          <w:sz w:val="24"/>
-        </w:rPr>
-        <w:t xml:space="preserve"> </w:t>
-      </w:r>
-      <w:hyperlink r:id="rId26">
-        <w:r>
-          <w:rPr>
-            <w:rFonts w:ascii="Calibri"/>
-            <w:i/>
-            <w:color w:val="1154CC"/>
-            <w:sz w:val="24"/>
-            <w:u w:val="single" w:color="1154CC"/>
-          </w:rPr>
-          <w:t>kadidja.oliveira@ceub.edu.br</w:t>
-        </w:r>
-      </w:hyperlink>
-      <w:r>
-        <w:rPr>
-          <w:rFonts w:ascii="Calibri"/>
-          <w:i/>
-          <w:color w:val="1154CC"/>
-          <w:spacing w:val="14"/>
-          <w:sz w:val="24"/>
-        </w:rPr>
-        <w:t xml:space="preserve"> </w:t>
-      </w:r>
-      <w:r>
-        <w:rPr>
-          <w:rFonts w:ascii="Arial"/>
-          <w:i/>
-          <w:spacing w:val="-10"/>
-          <w:sz w:val="24"/>
-        </w:rPr>
-        <w:t>)</w:t>
       </w:r>
     </w:p>
     <w:p>
@@ -20080,63 +20498,10 @@
       </w:pPr>
       <w:r>
         <w:rPr>
-          <w:sz w:val="24"/>
-        </w:rPr>
-        <w:t>Gestão</w:t>
-      </w:r>
-      <w:r>
-        <w:rPr>
-          <w:spacing w:val="1"/>
-          <w:sz w:val="24"/>
-        </w:rPr>
-        <w:t xml:space="preserve"> </w:t>
-      </w:r>
-      <w:r>
-        <w:rPr>
-          <w:sz w:val="24"/>
-        </w:rPr>
-        <w:t>do</w:t>
-      </w:r>
-      <w:r>
-        <w:rPr>
-          <w:spacing w:val="2"/>
-          <w:sz w:val="24"/>
-        </w:rPr>
-        <w:t xml:space="preserve"> </w:t>
-      </w:r>
-      <w:r>
-        <w:rPr>
-          <w:sz w:val="24"/>
-        </w:rPr>
-        <w:t>Projeto</w:t>
-      </w:r>
-      <w:r>
-        <w:rPr>
-          <w:spacing w:val="43"/>
-          <w:w w:val="150"/>
-          <w:sz w:val="24"/>
-        </w:rPr>
-        <w:t xml:space="preserve"> </w:t>
-      </w:r>
-      <w:r>
-        <w:rPr>
-          <w:sz w:val="24"/>
-        </w:rPr>
-        <w:t>(Azure</w:t>
-      </w:r>
-      <w:r>
-        <w:rPr>
-          <w:spacing w:val="1"/>
-          <w:sz w:val="24"/>
-        </w:rPr>
-        <w:t xml:space="preserve"> </w:t>
-      </w:r>
-      <w:r>
-        <w:rPr>
           <w:spacing w:val="-2"/>
           <w:sz w:val="24"/>
         </w:rPr>
-        <w:t>DevOps)</w:t>
+        <w:t>Metodologia Ágil (Scrum)</w:t>
       </w:r>
     </w:p>
     <w:p>
@@ -20157,49 +20522,58 @@
       </w:pPr>
       <w:r>
         <w:rPr>
-          <w:sz w:val="24"/>
-        </w:rPr>
-        <w:t>Gestão</w:t>
-      </w:r>
-      <w:r>
-        <w:rPr>
-          <w:spacing w:val="16"/>
-          <w:sz w:val="24"/>
-        </w:rPr>
-        <w:t xml:space="preserve"> </w:t>
-      </w:r>
-      <w:r>
-        <w:rPr>
-          <w:sz w:val="24"/>
-        </w:rPr>
-        <w:t>da</w:t>
-      </w:r>
-      <w:r>
-        <w:rPr>
-          <w:spacing w:val="16"/>
-          <w:sz w:val="24"/>
-        </w:rPr>
-        <w:t xml:space="preserve"> </w:t>
-      </w:r>
-      <w:r>
-        <w:rPr>
-          <w:sz w:val="24"/>
-        </w:rPr>
-        <w:t>Configuração</w:t>
-      </w:r>
-      <w:r>
-        <w:rPr>
-          <w:spacing w:val="11"/>
-          <w:sz w:val="24"/>
-        </w:rPr>
-        <w:t xml:space="preserve"> </w:t>
-      </w:r>
-      <w:r>
-        <w:rPr>
           <w:spacing w:val="-2"/>
           <w:sz w:val="24"/>
         </w:rPr>
-        <w:t>(GitHub)</w:t>
+        <w:t>Sprints</w:t>
+      </w:r>
+    </w:p>
+    <w:p>
+      <w:pPr>
+        <w:pStyle w:val="PargrafodaLista"/>
+        <w:numPr>
+          <w:ilvl w:val="1"/>
+          <w:numId w:val="1"/>
+        </w:numPr>
+        <w:tabs>
+          <w:tab w:val="left" w:pos="860"/>
+        </w:tabs>
+        <w:spacing w:line="281" w:lineRule="exact"/>
+        <w:ind w:left="860" w:hanging="359"/>
+        <w:rPr>
+          <w:sz w:val="24"/>
+        </w:rPr>
+      </w:pPr>
+      <w:r>
+        <w:rPr>
+          <w:spacing w:val="-2"/>
+          <w:sz w:val="24"/>
+        </w:rPr>
+        <w:t>Daily Meetings</w:t>
+      </w:r>
+    </w:p>
+    <w:p>
+      <w:pPr>
+        <w:pStyle w:val="PargrafodaLista"/>
+        <w:numPr>
+          <w:ilvl w:val="1"/>
+          <w:numId w:val="1"/>
+        </w:numPr>
+        <w:tabs>
+          <w:tab w:val="left" w:pos="860"/>
+        </w:tabs>
+        <w:spacing w:line="281" w:lineRule="exact"/>
+        <w:ind w:left="860" w:hanging="359"/>
+        <w:rPr>
+          <w:sz w:val="24"/>
+        </w:rPr>
+      </w:pPr>
+      <w:r>
+        <w:rPr>
+          <w:spacing w:val="-2"/>
+          <w:sz w:val="24"/>
+        </w:rPr>
+        <w:t>Kanban</w:t>
       </w:r>
     </w:p>
     <w:p>
@@ -20222,27 +20596,97 @@
         <w:rPr>
           <w:sz w:val="24"/>
         </w:rPr>
-        <w:t>Desenvolvimento</w:t>
-      </w:r>
-      <w:r>
-        <w:rPr>
-          <w:spacing w:val="6"/>
-          <w:sz w:val="24"/>
-        </w:rPr>
-        <w:t xml:space="preserve"> </w:t>
-      </w:r>
-      <w:r>
-        <w:rPr>
-          <w:sz w:val="24"/>
-        </w:rPr>
-        <w:t>Front-</w:t>
-      </w:r>
-      <w:r>
-        <w:rPr>
-          <w:spacing w:val="-5"/>
-          <w:sz w:val="24"/>
-        </w:rPr>
-        <w:t>End</w:t>
+        <w:t>Gestão do Projeto</w:t>
+      </w:r>
+    </w:p>
+    <w:p>
+      <w:pPr>
+        <w:pStyle w:val="PargrafodaLista"/>
+        <w:numPr>
+          <w:ilvl w:val="1"/>
+          <w:numId w:val="1"/>
+        </w:numPr>
+        <w:tabs>
+          <w:tab w:val="left" w:pos="567"/>
+        </w:tabs>
+        <w:spacing w:line="278" w:lineRule="exact"/>
+        <w:rPr>
+          <w:sz w:val="24"/>
+        </w:rPr>
+      </w:pPr>
+      <w:r>
+        <w:rPr>
+          <w:sz w:val="24"/>
+        </w:rPr>
+        <w:t>Azure DevOps</w:t>
+      </w:r>
+    </w:p>
+    <w:p>
+      <w:pPr>
+        <w:pStyle w:val="PargrafodaLista"/>
+        <w:numPr>
+          <w:ilvl w:val="1"/>
+          <w:numId w:val="1"/>
+        </w:numPr>
+        <w:tabs>
+          <w:tab w:val="left" w:pos="567"/>
+        </w:tabs>
+        <w:spacing w:line="278" w:lineRule="exact"/>
+        <w:rPr>
+          <w:sz w:val="24"/>
+        </w:rPr>
+      </w:pPr>
+      <w:r>
+        <w:rPr>
+          <w:sz w:val="24"/>
+        </w:rPr>
+        <w:t>Azure Boards</w:t>
+      </w:r>
+    </w:p>
+    <w:p>
+      <w:pPr>
+        <w:pStyle w:val="PargrafodaLista"/>
+        <w:numPr>
+          <w:ilvl w:val="0"/>
+          <w:numId w:val="1"/>
+        </w:numPr>
+        <w:tabs>
+          <w:tab w:val="left" w:pos="567"/>
+        </w:tabs>
+        <w:spacing w:line="278" w:lineRule="exact"/>
+        <w:ind w:left="567" w:hanging="359"/>
+        <w:rPr>
+          <w:sz w:val="24"/>
+        </w:rPr>
+      </w:pPr>
+      <w:r>
+        <w:rPr>
+          <w:sz w:val="24"/>
+        </w:rPr>
+        <w:t>Gestão da Configuração (GitHub)</w:t>
+      </w:r>
+    </w:p>
+    <w:p>
+      <w:pPr>
+        <w:pStyle w:val="PargrafodaLista"/>
+        <w:numPr>
+          <w:ilvl w:val="0"/>
+          <w:numId w:val="1"/>
+        </w:numPr>
+        <w:tabs>
+          <w:tab w:val="left" w:pos="567"/>
+        </w:tabs>
+        <w:spacing w:line="278" w:lineRule="exact"/>
+        <w:ind w:left="567" w:hanging="359"/>
+        <w:rPr>
+          <w:sz w:val="24"/>
+        </w:rPr>
+      </w:pPr>
+      <w:r>
+        <w:rPr>
+          <w:sz w:val="24"/>
+        </w:rPr>
+        <w:t>Desenvolvimento Front-End</w:t>
       </w:r>
     </w:p>
     <w:p>
@@ -20269,6 +20713,32 @@
       </w:r>
       <w:r>
         <w:rPr>
+          <w:spacing w:val="5"/>
+          <w:sz w:val="24"/>
+        </w:rPr>
+        <w:t xml:space="preserve"> </w:t>
+      </w:r>
+      <w:r>
+        <w:rPr>
+          <w:sz w:val="24"/>
+        </w:rPr>
+        <w:t>-</w:t>
+      </w:r>
+      <w:r>
+        <w:rPr>
+          <w:spacing w:val="6"/>
+          <w:sz w:val="24"/>
+        </w:rPr>
+        <w:t xml:space="preserve"> </w:t>
+      </w:r>
+      <w:r>
+        <w:rPr>
+          <w:sz w:val="24"/>
+        </w:rPr>
+        <w:t>Aplicação</w:t>
+      </w:r>
+      <w:r>
+        <w:rPr>
           <w:spacing w:val="-8"/>
           <w:sz w:val="24"/>
         </w:rPr>
@@ -20276,86 +20746,109 @@
       </w:r>
       <w:r>
         <w:rPr>
-          <w:sz w:val="24"/>
-        </w:rPr>
-        <w:t>-</w:t>
-      </w:r>
-      <w:r>
-        <w:rPr>
-          <w:spacing w:val="-8"/>
-          <w:sz w:val="24"/>
-        </w:rPr>
-        <w:t xml:space="preserve"> </w:t>
-      </w:r>
-      <w:r>
-        <w:rPr>
-          <w:spacing w:val="-2"/>
-          <w:sz w:val="24"/>
-        </w:rPr>
-        <w:t>Aplicativo</w:t>
+          <w:spacing w:val="-5"/>
+          <w:sz w:val="24"/>
+        </w:rPr>
+        <w:t>Web</w:t>
       </w:r>
     </w:p>
     <w:p>
       <w:pPr>
         <w:pStyle w:val="PargrafodaLista"/>
         <w:numPr>
-          <w:ilvl w:val="1"/>
+          <w:ilvl w:val="2"/>
           <w:numId w:val="1"/>
         </w:numPr>
         <w:tabs>
           <w:tab w:val="left" w:pos="860"/>
         </w:tabs>
         <w:spacing w:line="278" w:lineRule="exact"/>
-        <w:ind w:left="860" w:hanging="359"/>
-        <w:rPr>
-          <w:sz w:val="24"/>
-        </w:rPr>
-      </w:pPr>
-      <w:r>
-        <w:rPr>
-          <w:sz w:val="24"/>
-        </w:rPr>
-        <w:t>Frontend</w:t>
-      </w:r>
-      <w:r>
-        <w:rPr>
-          <w:spacing w:val="5"/>
-          <w:sz w:val="24"/>
-        </w:rPr>
-        <w:t xml:space="preserve"> </w:t>
-      </w:r>
-      <w:r>
-        <w:rPr>
-          <w:sz w:val="24"/>
-        </w:rPr>
-        <w:t>-</w:t>
-      </w:r>
-      <w:r>
-        <w:rPr>
-          <w:spacing w:val="6"/>
-          <w:sz w:val="24"/>
-        </w:rPr>
-        <w:t xml:space="preserve"> </w:t>
-      </w:r>
-      <w:r>
-        <w:rPr>
-          <w:sz w:val="24"/>
-        </w:rPr>
-        <w:t>Aplicação</w:t>
-      </w:r>
-      <w:r>
-        <w:rPr>
-          <w:spacing w:val="-8"/>
-          <w:sz w:val="24"/>
-        </w:rPr>
-        <w:t xml:space="preserve"> </w:t>
-      </w:r>
+        <w:rPr>
+          <w:sz w:val="24"/>
+        </w:rPr>
+      </w:pPr>
       <w:r>
         <w:rPr>
           <w:spacing w:val="-5"/>
           <w:sz w:val="24"/>
         </w:rPr>
-        <w:t>Web</w:t>
+        <w:t>HTML5</w:t>
+      </w:r>
+    </w:p>
+    <w:p>
+      <w:pPr>
+        <w:pStyle w:val="PargrafodaLista"/>
+        <w:numPr>
+          <w:ilvl w:val="2"/>
+          <w:numId w:val="1"/>
+        </w:numPr>
+        <w:tabs>
+          <w:tab w:val="left" w:pos="860"/>
+        </w:tabs>
+        <w:spacing w:line="278" w:lineRule="exact"/>
+        <w:rPr>
+          <w:sz w:val="24"/>
+        </w:rPr>
+      </w:pPr>
+      <w:r>
+        <w:rPr>
+          <w:spacing w:val="-5"/>
+          <w:sz w:val="24"/>
+        </w:rPr>
+        <w:t>CSS3</w:t>
+      </w:r>
+    </w:p>
+    <w:p>
+      <w:pPr>
+        <w:pStyle w:val="PargrafodaLista"/>
+        <w:numPr>
+          <w:ilvl w:val="2"/>
+          <w:numId w:val="1"/>
+        </w:numPr>
+        <w:tabs>
+          <w:tab w:val="left" w:pos="860"/>
+        </w:tabs>
+        <w:spacing w:line="278" w:lineRule="exact"/>
+        <w:rPr>
+          <w:sz w:val="24"/>
+        </w:rPr>
+      </w:pPr>
+      <w:r>
+        <w:rPr>
+          <w:spacing w:val="-5"/>
+          <w:sz w:val="24"/>
+        </w:rPr>
+        <w:t>JavaScript</w:t>
+      </w:r>
+      <w:r>
+        <w:rPr>
+          <w:spacing w:val="-5"/>
+          <w:sz w:val="24"/>
+        </w:rPr>
+        <w:t xml:space="preserve"> Vanilla</w:t>
+      </w:r>
+    </w:p>
+    <w:p>
+      <w:pPr>
+        <w:pStyle w:val="PargrafodaLista"/>
+        <w:numPr>
+          <w:ilvl w:val="2"/>
+          <w:numId w:val="1"/>
+        </w:numPr>
+        <w:tabs>
+          <w:tab w:val="left" w:pos="860"/>
+        </w:tabs>
+        <w:spacing w:line="278" w:lineRule="exact"/>
+        <w:rPr>
+          <w:sz w:val="24"/>
+        </w:rPr>
+      </w:pPr>
+      <w:r>
+        <w:rPr>
+          <w:spacing w:val="-5"/>
+          <w:sz w:val="24"/>
+        </w:rPr>
+        <w:t>Fetch API (Consumo da API REST)</w:t>
       </w:r>
     </w:p>
     <w:p>
@@ -20403,33 +20896,90 @@
           <w:numId w:val="1"/>
         </w:numPr>
         <w:tabs>
-          <w:tab w:val="left" w:pos="860"/>
+          <w:tab w:val="left" w:pos="567"/>
         </w:tabs>
         <w:spacing w:line="281" w:lineRule="exact"/>
-        <w:ind w:left="860" w:hanging="359"/>
-        <w:rPr>
-          <w:sz w:val="24"/>
-        </w:rPr>
-      </w:pPr>
-      <w:r>
-        <w:rPr>
-          <w:sz w:val="24"/>
-        </w:rPr>
-        <w:t>API</w:t>
-      </w:r>
-      <w:r>
-        <w:rPr>
-          <w:spacing w:val="7"/>
-          <w:sz w:val="24"/>
-        </w:rPr>
-        <w:t xml:space="preserve"> </w:t>
-      </w:r>
+        <w:rPr>
+          <w:sz w:val="24"/>
+        </w:rPr>
+      </w:pPr>
       <w:r>
         <w:rPr>
           <w:spacing w:val="-2"/>
           <w:sz w:val="24"/>
         </w:rPr>
-        <w:t>Management</w:t>
+        <w:t>Python 3.12</w:t>
+      </w:r>
+    </w:p>
+    <w:p>
+      <w:pPr>
+        <w:pStyle w:val="PargrafodaLista"/>
+        <w:numPr>
+          <w:ilvl w:val="1"/>
+          <w:numId w:val="1"/>
+        </w:numPr>
+        <w:tabs>
+          <w:tab w:val="left" w:pos="567"/>
+        </w:tabs>
+        <w:spacing w:line="281" w:lineRule="exact"/>
+        <w:rPr>
+          <w:sz w:val="24"/>
+        </w:rPr>
+      </w:pPr>
+      <w:r>
+        <w:rPr>
+          <w:spacing w:val="-2"/>
+          <w:sz w:val="24"/>
+        </w:rPr>
+        <w:t>FastAPI 0.115 (Framework web assíncrono)</w:t>
+      </w:r>
+    </w:p>
+    <w:p>
+      <w:pPr>
+        <w:pStyle w:val="PargrafodaLista"/>
+        <w:numPr>
+          <w:ilvl w:val="1"/>
+          <w:numId w:val="1"/>
+        </w:numPr>
+        <w:tabs>
+          <w:tab w:val="left" w:pos="567"/>
+        </w:tabs>
+        <w:spacing w:line="281" w:lineRule="exact"/>
+        <w:rPr>
+          <w:sz w:val="24"/>
+          <w:lang w:val="en-US"/>
+        </w:rPr>
+      </w:pPr>
+      <w:r>
+        <w:rPr>
+          <w:spacing w:val="-2"/>
+          <w:sz w:val="24"/>
+          <w:lang w:val="en-US"/>
+        </w:rPr>
+        <w:t>SQLAlchemy 2.0 (ORM – Object Relational Mapping)</w:t>
+      </w:r>
+    </w:p>
+    <w:p>
+      <w:pPr>
+        <w:pStyle w:val="PargrafodaLista"/>
+        <w:numPr>
+          <w:ilvl w:val="1"/>
+          <w:numId w:val="1"/>
+        </w:numPr>
+        <w:tabs>
+          <w:tab w:val="left" w:pos="567"/>
+        </w:tabs>
+        <w:spacing w:line="281" w:lineRule="exact"/>
+        <w:rPr>
+          <w:sz w:val="24"/>
+        </w:rPr>
+      </w:pPr>
+      <w:r>
+        <w:rPr>
+          <w:spacing w:val="-2"/>
+          <w:sz w:val="24"/>
+        </w:rPr>
+        <w:t>PostgreSQL (Banco de Dados)</w:t>
       </w:r>
     </w:p>
     <w:p>
@@ -20442,7 +20992,7 @@
         <w:tabs>
           <w:tab w:val="left" w:pos="860"/>
         </w:tabs>
-        <w:spacing w:line="279" w:lineRule="exact"/>
+        <w:spacing w:line="281" w:lineRule="exact"/>
         <w:ind w:left="860" w:hanging="359"/>
         <w:rPr>
           <w:sz w:val="24"/>
@@ -20452,34 +21002,7 @@
         <w:rPr>
           <w:sz w:val="24"/>
         </w:rPr>
-        <w:t>Servidor</w:t>
-      </w:r>
-      <w:r>
-        <w:rPr>
-          <w:spacing w:val="5"/>
-          <w:sz w:val="24"/>
-        </w:rPr>
-        <w:t xml:space="preserve"> </w:t>
-      </w:r>
-      <w:r>
-        <w:rPr>
-          <w:sz w:val="24"/>
-        </w:rPr>
-        <w:t>de</w:t>
-      </w:r>
-      <w:r>
-        <w:rPr>
-          <w:spacing w:val="4"/>
-          <w:sz w:val="24"/>
-        </w:rPr>
-        <w:t xml:space="preserve"> </w:t>
-      </w:r>
-      <w:r>
-        <w:rPr>
-          <w:spacing w:val="-2"/>
-          <w:sz w:val="24"/>
-        </w:rPr>
-        <w:t>Aplicação</w:t>
+        <w:t>JWT e Bcrypt (Autenticação e criptografia)</w:t>
       </w:r>
     </w:p>
     <w:p>
@@ -20492,7 +21015,7 @@
         <w:tabs>
           <w:tab w:val="left" w:pos="860"/>
         </w:tabs>
-        <w:spacing w:line="278" w:lineRule="exact"/>
+        <w:spacing w:line="281" w:lineRule="exact"/>
         <w:ind w:left="860" w:hanging="359"/>
         <w:rPr>
           <w:sz w:val="24"/>
@@ -20502,86 +21025,7 @@
         <w:rPr>
           <w:sz w:val="24"/>
         </w:rPr>
-        <w:t>Sistema</w:t>
-      </w:r>
-      <w:r>
-        <w:rPr>
-          <w:spacing w:val="16"/>
-          <w:sz w:val="24"/>
-        </w:rPr>
-        <w:t xml:space="preserve"> </w:t>
-      </w:r>
-      <w:r>
-        <w:rPr>
-          <w:sz w:val="24"/>
-        </w:rPr>
-        <w:t>Gerenciador</w:t>
-      </w:r>
-      <w:r>
-        <w:rPr>
-          <w:spacing w:val="10"/>
-          <w:sz w:val="24"/>
-        </w:rPr>
-        <w:t xml:space="preserve"> </w:t>
-      </w:r>
-      <w:r>
-        <w:rPr>
-          <w:sz w:val="24"/>
-        </w:rPr>
-        <w:t>de</w:t>
-      </w:r>
-      <w:r>
-        <w:rPr>
-          <w:spacing w:val="17"/>
-          <w:sz w:val="24"/>
-        </w:rPr>
-        <w:t xml:space="preserve"> </w:t>
-      </w:r>
-      <w:r>
-        <w:rPr>
-          <w:sz w:val="24"/>
-        </w:rPr>
-        <w:t>Banco</w:t>
-      </w:r>
-      <w:r>
-        <w:rPr>
-          <w:spacing w:val="10"/>
-          <w:sz w:val="24"/>
-        </w:rPr>
-        <w:t xml:space="preserve"> </w:t>
-      </w:r>
-      <w:r>
-        <w:rPr>
-          <w:sz w:val="24"/>
-        </w:rPr>
-        <w:t>de</w:t>
-      </w:r>
-      <w:r>
-        <w:rPr>
-          <w:spacing w:val="17"/>
-          <w:sz w:val="24"/>
-        </w:rPr>
-        <w:t xml:space="preserve"> </w:t>
-      </w:r>
-      <w:r>
-        <w:rPr>
-          <w:sz w:val="24"/>
-        </w:rPr>
-        <w:t>Dados</w:t>
-      </w:r>
-      <w:r>
-        <w:rPr>
-          <w:spacing w:val="17"/>
-          <w:sz w:val="24"/>
-        </w:rPr>
-        <w:t xml:space="preserve"> </w:t>
-      </w:r>
-      <w:r>
-        <w:rPr>
-          <w:spacing w:val="-2"/>
-          <w:sz w:val="24"/>
-        </w:rPr>
-        <w:t>(PostgreSQL)</w:t>
+        <w:t>Pydantic 2.0 (Validação de dados)</w:t>
       </w:r>
     </w:p>
     <w:p>
@@ -20604,60 +21048,7 @@
         <w:rPr>
           <w:sz w:val="24"/>
         </w:rPr>
-        <w:t>Testes</w:t>
-      </w:r>
-      <w:r>
-        <w:rPr>
-          <w:spacing w:val="5"/>
-          <w:sz w:val="24"/>
-        </w:rPr>
-        <w:t xml:space="preserve"> </w:t>
-      </w:r>
-      <w:r>
-        <w:rPr>
-          <w:sz w:val="24"/>
-        </w:rPr>
-        <w:t>e</w:t>
-      </w:r>
-      <w:r>
-        <w:rPr>
-          <w:spacing w:val="2"/>
-          <w:sz w:val="24"/>
-        </w:rPr>
-        <w:t xml:space="preserve"> </w:t>
-      </w:r>
-      <w:r>
-        <w:rPr>
-          <w:sz w:val="24"/>
-        </w:rPr>
-        <w:t>gestão</w:t>
-      </w:r>
-      <w:r>
-        <w:rPr>
-          <w:spacing w:val="2"/>
-          <w:sz w:val="24"/>
-        </w:rPr>
-        <w:t xml:space="preserve"> </w:t>
-      </w:r>
-      <w:r>
-        <w:rPr>
-          <w:sz w:val="24"/>
-        </w:rPr>
-        <w:t>de</w:t>
-      </w:r>
-      <w:r>
-        <w:rPr>
-          <w:spacing w:val="7"/>
-          <w:sz w:val="24"/>
-        </w:rPr>
-        <w:t xml:space="preserve"> </w:t>
-      </w:r>
-      <w:r>
-        <w:rPr>
-          <w:spacing w:val="-2"/>
-          <w:sz w:val="24"/>
-        </w:rPr>
-        <w:t>demandas</w:t>
+        <w:t>Deployment</w:t>
       </w:r>
     </w:p>
     <w:p>
@@ -20680,73 +21071,7 @@
         <w:rPr>
           <w:sz w:val="24"/>
         </w:rPr>
-        <w:t>Automação</w:t>
-      </w:r>
-      <w:r>
-        <w:rPr>
-          <w:spacing w:val="1"/>
-          <w:sz w:val="24"/>
-        </w:rPr>
-        <w:t xml:space="preserve"> </w:t>
-      </w:r>
-      <w:r>
-        <w:rPr>
-          <w:sz w:val="24"/>
-        </w:rPr>
-        <w:t>de</w:t>
-      </w:r>
-      <w:r>
-        <w:rPr>
-          <w:spacing w:val="1"/>
-          <w:sz w:val="24"/>
-        </w:rPr>
-        <w:t xml:space="preserve"> </w:t>
-      </w:r>
-      <w:r>
-        <w:rPr>
-          <w:sz w:val="24"/>
-        </w:rPr>
-        <w:t>testes</w:t>
-      </w:r>
-      <w:r>
-        <w:rPr>
-          <w:spacing w:val="1"/>
-          <w:sz w:val="24"/>
-        </w:rPr>
-        <w:t xml:space="preserve"> </w:t>
-      </w:r>
-      <w:r>
-        <w:rPr>
-          <w:sz w:val="24"/>
-        </w:rPr>
-        <w:t>(Ainda</w:t>
-      </w:r>
-      <w:r>
-        <w:rPr>
-          <w:spacing w:val="1"/>
-          <w:sz w:val="24"/>
-        </w:rPr>
-        <w:t xml:space="preserve"> </w:t>
-      </w:r>
-      <w:r>
-        <w:rPr>
-          <w:sz w:val="24"/>
-        </w:rPr>
-        <w:t>não</w:t>
-      </w:r>
-      <w:r>
-        <w:rPr>
-          <w:spacing w:val="2"/>
-          <w:sz w:val="24"/>
-        </w:rPr>
-        <w:t xml:space="preserve"> </w:t>
-      </w:r>
-      <w:r>
-        <w:rPr>
-          <w:spacing w:val="-2"/>
-          <w:sz w:val="24"/>
-        </w:rPr>
-        <w:t>realizado)</w:t>
+        <w:t>Neon (PostgreSQL serverless)</w:t>
       </w:r>
     </w:p>
     <w:p>
@@ -20769,312 +21094,7 @@
         <w:rPr>
           <w:sz w:val="24"/>
         </w:rPr>
-        <w:t>Bug</w:t>
-      </w:r>
-      <w:r>
-        <w:rPr>
-          <w:spacing w:val="1"/>
-          <w:sz w:val="24"/>
-        </w:rPr>
-        <w:t xml:space="preserve"> </w:t>
-      </w:r>
-      <w:r>
-        <w:rPr>
-          <w:sz w:val="24"/>
-        </w:rPr>
-        <w:t>Tracking</w:t>
-      </w:r>
-      <w:r>
-        <w:rPr>
-          <w:spacing w:val="-3"/>
-          <w:sz w:val="24"/>
-        </w:rPr>
-        <w:t xml:space="preserve"> </w:t>
-      </w:r>
-      <w:r>
-        <w:rPr>
-          <w:sz w:val="24"/>
-        </w:rPr>
-        <w:t>(Ainda</w:t>
-      </w:r>
-      <w:r>
-        <w:rPr>
-          <w:spacing w:val="1"/>
-          <w:sz w:val="24"/>
-        </w:rPr>
-        <w:t xml:space="preserve"> </w:t>
-      </w:r>
-      <w:r>
-        <w:rPr>
-          <w:sz w:val="24"/>
-        </w:rPr>
-        <w:t>não</w:t>
-      </w:r>
-      <w:r>
-        <w:rPr>
-          <w:spacing w:val="2"/>
-          <w:sz w:val="24"/>
-        </w:rPr>
-        <w:t xml:space="preserve"> </w:t>
-      </w:r>
-      <w:r>
-        <w:rPr>
-          <w:spacing w:val="-2"/>
-          <w:sz w:val="24"/>
-        </w:rPr>
-        <w:t>realizado)</w:t>
-      </w:r>
-    </w:p>
-    <w:p>
-      <w:pPr>
-        <w:pStyle w:val="PargrafodaLista"/>
-        <w:numPr>
-          <w:ilvl w:val="0"/>
-          <w:numId w:val="1"/>
-        </w:numPr>
-        <w:tabs>
-          <w:tab w:val="left" w:pos="567"/>
-        </w:tabs>
-        <w:spacing w:line="279" w:lineRule="exact"/>
-        <w:ind w:left="567" w:hanging="359"/>
-        <w:rPr>
-          <w:sz w:val="24"/>
-        </w:rPr>
-      </w:pPr>
-      <w:r>
-        <w:rPr>
-          <w:spacing w:val="-2"/>
-          <w:sz w:val="24"/>
-        </w:rPr>
-        <w:t>Analítica</w:t>
-      </w:r>
-    </w:p>
-    <w:p>
-      <w:pPr>
-        <w:pStyle w:val="PargrafodaLista"/>
-        <w:numPr>
-          <w:ilvl w:val="1"/>
-          <w:numId w:val="1"/>
-        </w:numPr>
-        <w:tabs>
-          <w:tab w:val="left" w:pos="860"/>
-        </w:tabs>
-        <w:spacing w:line="279" w:lineRule="exact"/>
-        <w:ind w:left="860" w:hanging="359"/>
-        <w:rPr>
-          <w:sz w:val="24"/>
-        </w:rPr>
-      </w:pPr>
-      <w:r>
-        <w:rPr>
-          <w:sz w:val="24"/>
-        </w:rPr>
-        <w:t>Extração,</w:t>
-      </w:r>
-      <w:r>
-        <w:rPr>
-          <w:spacing w:val="7"/>
-          <w:sz w:val="24"/>
-        </w:rPr>
-        <w:t xml:space="preserve"> </w:t>
-      </w:r>
-      <w:r>
-        <w:rPr>
-          <w:sz w:val="24"/>
-        </w:rPr>
-        <w:t>Transformação</w:t>
-      </w:r>
-      <w:r>
-        <w:rPr>
-          <w:spacing w:val="8"/>
-          <w:sz w:val="24"/>
-        </w:rPr>
-        <w:t xml:space="preserve"> </w:t>
-      </w:r>
-      <w:r>
-        <w:rPr>
-          <w:sz w:val="24"/>
-        </w:rPr>
-        <w:t>e</w:t>
-      </w:r>
-      <w:r>
-        <w:rPr>
-          <w:spacing w:val="8"/>
-          <w:sz w:val="24"/>
-        </w:rPr>
-        <w:t xml:space="preserve"> </w:t>
-      </w:r>
-      <w:r>
-        <w:rPr>
-          <w:sz w:val="24"/>
-        </w:rPr>
-        <w:t>Carga</w:t>
-      </w:r>
-      <w:r>
-        <w:rPr>
-          <w:spacing w:val="8"/>
-          <w:sz w:val="24"/>
-        </w:rPr>
-        <w:t xml:space="preserve"> </w:t>
-      </w:r>
-      <w:r>
-        <w:rPr>
-          <w:sz w:val="24"/>
-        </w:rPr>
-        <w:t>(Power</w:t>
-      </w:r>
-      <w:r>
-        <w:rPr>
-          <w:spacing w:val="10"/>
-          <w:sz w:val="24"/>
-        </w:rPr>
-        <w:t xml:space="preserve"> </w:t>
-      </w:r>
-      <w:r>
-        <w:rPr>
-          <w:spacing w:val="-5"/>
-          <w:sz w:val="24"/>
-        </w:rPr>
-        <w:t>BI)</w:t>
-      </w:r>
-    </w:p>
-    <w:p>
-      <w:pPr>
-        <w:pStyle w:val="PargrafodaLista"/>
-        <w:numPr>
-          <w:ilvl w:val="1"/>
-          <w:numId w:val="1"/>
-        </w:numPr>
-        <w:tabs>
-          <w:tab w:val="left" w:pos="860"/>
-        </w:tabs>
-        <w:spacing w:line="278" w:lineRule="exact"/>
-        <w:ind w:left="860" w:hanging="359"/>
-        <w:rPr>
-          <w:sz w:val="24"/>
-        </w:rPr>
-      </w:pPr>
-      <w:r>
-        <w:rPr>
-          <w:sz w:val="24"/>
-        </w:rPr>
-        <w:t>Visualização</w:t>
-      </w:r>
-      <w:r>
-        <w:rPr>
-          <w:spacing w:val="10"/>
-          <w:sz w:val="24"/>
-        </w:rPr>
-        <w:t xml:space="preserve"> </w:t>
-      </w:r>
-      <w:r>
-        <w:rPr>
-          <w:sz w:val="24"/>
-        </w:rPr>
-        <w:t>de</w:t>
-      </w:r>
-      <w:r>
-        <w:rPr>
-          <w:spacing w:val="17"/>
-          <w:sz w:val="24"/>
-        </w:rPr>
-        <w:t xml:space="preserve"> </w:t>
-      </w:r>
-      <w:r>
-        <w:rPr>
-          <w:sz w:val="24"/>
-        </w:rPr>
-        <w:t>dados</w:t>
-      </w:r>
-      <w:r>
-        <w:rPr>
-          <w:spacing w:val="15"/>
-          <w:sz w:val="24"/>
-        </w:rPr>
-        <w:t xml:space="preserve"> </w:t>
-      </w:r>
-      <w:r>
-        <w:rPr>
-          <w:sz w:val="24"/>
-        </w:rPr>
-        <w:t>(Power</w:t>
-      </w:r>
-      <w:r>
-        <w:rPr>
-          <w:spacing w:val="18"/>
-          <w:sz w:val="24"/>
-        </w:rPr>
-        <w:t xml:space="preserve"> </w:t>
-      </w:r>
-      <w:r>
-        <w:rPr>
-          <w:spacing w:val="-5"/>
-          <w:sz w:val="24"/>
-        </w:rPr>
-        <w:t>BI)</w:t>
-      </w:r>
-    </w:p>
-    <w:p>
-      <w:pPr>
-        <w:pStyle w:val="PargrafodaLista"/>
-        <w:numPr>
-          <w:ilvl w:val="0"/>
-          <w:numId w:val="1"/>
-        </w:numPr>
-        <w:tabs>
-          <w:tab w:val="left" w:pos="567"/>
-        </w:tabs>
-        <w:spacing w:line="281" w:lineRule="exact"/>
-        <w:ind w:left="567" w:hanging="359"/>
-        <w:rPr>
-          <w:sz w:val="24"/>
-        </w:rPr>
-      </w:pPr>
-      <w:r>
-        <w:rPr>
-          <w:sz w:val="24"/>
-        </w:rPr>
-        <w:t>Marketing</w:t>
-      </w:r>
-      <w:r>
-        <w:rPr>
-          <w:spacing w:val="-4"/>
-          <w:sz w:val="24"/>
-        </w:rPr>
-        <w:t xml:space="preserve"> </w:t>
-      </w:r>
-      <w:r>
-        <w:rPr>
-          <w:sz w:val="24"/>
-        </w:rPr>
-        <w:t>(Ainda</w:t>
-      </w:r>
-      <w:r>
-        <w:rPr>
-          <w:spacing w:val="-6"/>
-          <w:sz w:val="24"/>
-        </w:rPr>
-        <w:t xml:space="preserve"> </w:t>
-      </w:r>
-      <w:r>
-        <w:rPr>
-          <w:sz w:val="24"/>
-        </w:rPr>
-        <w:t>não</w:t>
-      </w:r>
-      <w:r>
-        <w:rPr>
-          <w:spacing w:val="-6"/>
-          <w:sz w:val="24"/>
-        </w:rPr>
-        <w:t xml:space="preserve"> </w:t>
-      </w:r>
-      <w:r>
-        <w:rPr>
-          <w:spacing w:val="-2"/>
-          <w:sz w:val="24"/>
-        </w:rPr>
-        <w:t>realizado)</w:t>
+        <w:t>Vercel (Frontend)</w:t>
       </w:r>
     </w:p>
     <w:p>
@@ -21097,412 +21117,20 @@
         <w:rPr>
           <w:sz w:val="24"/>
         </w:rPr>
-        <w:t>Editoração</w:t>
-      </w:r>
-      <w:r>
-        <w:rPr>
-          <w:spacing w:val="6"/>
-          <w:sz w:val="24"/>
-        </w:rPr>
-        <w:t xml:space="preserve"> </w:t>
-      </w:r>
-      <w:r>
-        <w:rPr>
-          <w:sz w:val="24"/>
-        </w:rPr>
-        <w:t>de</w:t>
-      </w:r>
-      <w:r>
-        <w:rPr>
-          <w:spacing w:val="7"/>
-          <w:sz w:val="24"/>
-        </w:rPr>
-        <w:t xml:space="preserve"> </w:t>
-      </w:r>
-      <w:r>
-        <w:rPr>
-          <w:spacing w:val="-4"/>
-          <w:sz w:val="24"/>
-        </w:rPr>
-        <w:t>vídeo</w:t>
-      </w:r>
-    </w:p>
-    <w:p>
-      <w:pPr>
-        <w:pStyle w:val="PargrafodaLista"/>
-        <w:numPr>
-          <w:ilvl w:val="1"/>
-          <w:numId w:val="1"/>
-        </w:numPr>
-        <w:tabs>
-          <w:tab w:val="left" w:pos="860"/>
-        </w:tabs>
-        <w:spacing w:line="278" w:lineRule="exact"/>
-        <w:ind w:left="860" w:hanging="359"/>
-        <w:rPr>
-          <w:sz w:val="24"/>
-        </w:rPr>
-      </w:pPr>
-      <w:r>
-        <w:rPr>
-          <w:spacing w:val="-2"/>
-          <w:w w:val="105"/>
-          <w:sz w:val="24"/>
-        </w:rPr>
-        <w:t>Publicação</w:t>
-      </w:r>
-    </w:p>
-    <w:p>
-      <w:pPr>
-        <w:pStyle w:val="PargrafodaLista"/>
-        <w:numPr>
-          <w:ilvl w:val="1"/>
-          <w:numId w:val="1"/>
-        </w:numPr>
-        <w:tabs>
-          <w:tab w:val="left" w:pos="860"/>
-        </w:tabs>
-        <w:spacing w:line="278" w:lineRule="exact"/>
-        <w:ind w:left="860" w:hanging="359"/>
-        <w:rPr>
-          <w:sz w:val="24"/>
-        </w:rPr>
-      </w:pPr>
-      <w:r>
-        <w:rPr>
-          <w:w w:val="105"/>
-          <w:sz w:val="24"/>
-        </w:rPr>
-        <w:t>Redes</w:t>
-      </w:r>
-      <w:r>
-        <w:rPr>
-          <w:spacing w:val="1"/>
-          <w:w w:val="105"/>
-          <w:sz w:val="24"/>
-        </w:rPr>
-        <w:t xml:space="preserve"> </w:t>
-      </w:r>
-      <w:r>
-        <w:rPr>
-          <w:spacing w:val="-2"/>
-          <w:w w:val="105"/>
-          <w:sz w:val="24"/>
-        </w:rPr>
-        <w:t>Sociais</w:t>
-      </w:r>
-    </w:p>
-    <w:p>
-      <w:pPr>
-        <w:pStyle w:val="PargrafodaLista"/>
-        <w:numPr>
-          <w:ilvl w:val="0"/>
-          <w:numId w:val="1"/>
-        </w:numPr>
-        <w:tabs>
-          <w:tab w:val="left" w:pos="567"/>
-        </w:tabs>
-        <w:spacing w:line="279" w:lineRule="exact"/>
-        <w:ind w:left="567" w:hanging="359"/>
-        <w:rPr>
-          <w:sz w:val="24"/>
-        </w:rPr>
-      </w:pPr>
-      <w:r>
-        <w:rPr>
-          <w:sz w:val="24"/>
-        </w:rPr>
-        <w:t>Tecnologias</w:t>
-      </w:r>
-      <w:r>
-        <w:rPr>
-          <w:spacing w:val="-1"/>
-          <w:sz w:val="24"/>
-        </w:rPr>
-        <w:t xml:space="preserve"> </w:t>
-      </w:r>
-      <w:r>
-        <w:rPr>
-          <w:sz w:val="24"/>
-        </w:rPr>
-        <w:t>Habilitadoras</w:t>
-      </w:r>
-      <w:r>
-        <w:rPr>
-          <w:spacing w:val="6"/>
-          <w:sz w:val="24"/>
-        </w:rPr>
-        <w:t xml:space="preserve"> </w:t>
-      </w:r>
-      <w:r>
-        <w:rPr>
-          <w:sz w:val="24"/>
-        </w:rPr>
-        <w:t>Digitais</w:t>
-      </w:r>
-      <w:r>
-        <w:rPr>
-          <w:spacing w:val="6"/>
-          <w:sz w:val="24"/>
-        </w:rPr>
-        <w:t xml:space="preserve"> </w:t>
-      </w:r>
-      <w:r>
-        <w:rPr>
-          <w:sz w:val="24"/>
-        </w:rPr>
-        <w:t>(Se</w:t>
-      </w:r>
-      <w:r>
-        <w:rPr>
-          <w:spacing w:val="2"/>
-          <w:sz w:val="24"/>
-        </w:rPr>
-        <w:t xml:space="preserve"> </w:t>
-      </w:r>
-      <w:r>
-        <w:rPr>
-          <w:sz w:val="24"/>
-        </w:rPr>
-        <w:t>forem</w:t>
-      </w:r>
-      <w:r>
-        <w:rPr>
-          <w:spacing w:val="6"/>
-          <w:sz w:val="24"/>
-        </w:rPr>
-        <w:t xml:space="preserve"> </w:t>
-      </w:r>
-      <w:r>
-        <w:rPr>
-          <w:spacing w:val="-2"/>
-          <w:sz w:val="24"/>
-        </w:rPr>
-        <w:t>utilizadas)</w:t>
-      </w:r>
-    </w:p>
-    <w:p>
-      <w:pPr>
-        <w:pStyle w:val="PargrafodaLista"/>
-        <w:numPr>
-          <w:ilvl w:val="1"/>
-          <w:numId w:val="1"/>
-        </w:numPr>
-        <w:tabs>
-          <w:tab w:val="left" w:pos="860"/>
-        </w:tabs>
-        <w:spacing w:line="281" w:lineRule="exact"/>
-        <w:ind w:left="860" w:hanging="359"/>
-        <w:rPr>
-          <w:sz w:val="24"/>
-        </w:rPr>
-      </w:pPr>
-      <w:r>
-        <w:rPr>
-          <w:spacing w:val="-5"/>
-          <w:sz w:val="24"/>
-        </w:rPr>
-        <w:t>IOT</w:t>
-      </w:r>
-    </w:p>
-    <w:p>
-      <w:pPr>
-        <w:pStyle w:val="PargrafodaLista"/>
-        <w:numPr>
-          <w:ilvl w:val="1"/>
-          <w:numId w:val="1"/>
-        </w:numPr>
-        <w:tabs>
-          <w:tab w:val="left" w:pos="860"/>
-        </w:tabs>
-        <w:spacing w:line="281" w:lineRule="exact"/>
-        <w:ind w:left="860" w:hanging="359"/>
-        <w:rPr>
-          <w:sz w:val="24"/>
-        </w:rPr>
-      </w:pPr>
-      <w:r>
-        <w:rPr>
-          <w:spacing w:val="-5"/>
-          <w:w w:val="110"/>
-          <w:sz w:val="24"/>
-        </w:rPr>
-        <w:t>5G</w:t>
-      </w:r>
-    </w:p>
-    <w:p>
-      <w:pPr>
-        <w:pStyle w:val="PargrafodaLista"/>
-        <w:numPr>
-          <w:ilvl w:val="1"/>
-          <w:numId w:val="1"/>
-        </w:numPr>
-        <w:tabs>
-          <w:tab w:val="left" w:pos="860"/>
-        </w:tabs>
-        <w:spacing w:line="278" w:lineRule="exact"/>
-        <w:ind w:left="860" w:hanging="359"/>
-        <w:rPr>
-          <w:sz w:val="24"/>
-        </w:rPr>
-      </w:pPr>
-      <w:r>
-        <w:rPr>
-          <w:spacing w:val="-2"/>
-          <w:w w:val="105"/>
-          <w:sz w:val="24"/>
-        </w:rPr>
-        <w:t>Blockchain</w:t>
-      </w:r>
-    </w:p>
-    <w:p>
-      <w:pPr>
-        <w:pStyle w:val="PargrafodaLista"/>
-        <w:numPr>
-          <w:ilvl w:val="1"/>
-          <w:numId w:val="1"/>
-        </w:numPr>
-        <w:tabs>
-          <w:tab w:val="left" w:pos="860"/>
-        </w:tabs>
-        <w:spacing w:line="278" w:lineRule="exact"/>
-        <w:ind w:left="860" w:hanging="359"/>
-        <w:rPr>
-          <w:sz w:val="24"/>
-        </w:rPr>
-      </w:pPr>
-      <w:r>
-        <w:rPr>
-          <w:sz w:val="24"/>
-        </w:rPr>
-        <w:t>Machine</w:t>
-      </w:r>
-      <w:r>
-        <w:rPr>
-          <w:spacing w:val="22"/>
-          <w:sz w:val="24"/>
-        </w:rPr>
-        <w:t xml:space="preserve"> </w:t>
-      </w:r>
-      <w:r>
-        <w:rPr>
-          <w:spacing w:val="-2"/>
-          <w:sz w:val="24"/>
-        </w:rPr>
-        <w:t>Learning</w:t>
-      </w:r>
-    </w:p>
-    <w:p>
-      <w:pPr>
-        <w:pStyle w:val="PargrafodaLista"/>
-        <w:numPr>
-          <w:ilvl w:val="1"/>
-          <w:numId w:val="1"/>
-        </w:numPr>
-        <w:tabs>
-          <w:tab w:val="left" w:pos="860"/>
-        </w:tabs>
-        <w:spacing w:line="278" w:lineRule="exact"/>
-        <w:ind w:left="860" w:hanging="359"/>
-        <w:rPr>
-          <w:sz w:val="24"/>
-        </w:rPr>
-      </w:pPr>
-      <w:r>
-        <w:rPr>
-          <w:spacing w:val="-2"/>
-          <w:sz w:val="24"/>
-        </w:rPr>
-        <w:t>Inteligência</w:t>
-      </w:r>
-      <w:r>
-        <w:rPr>
-          <w:spacing w:val="-4"/>
-          <w:sz w:val="24"/>
-        </w:rPr>
-        <w:t xml:space="preserve"> </w:t>
-      </w:r>
-      <w:r>
-        <w:rPr>
-          <w:spacing w:val="-2"/>
-          <w:sz w:val="24"/>
-        </w:rPr>
-        <w:t>Artificial</w:t>
-      </w:r>
-    </w:p>
-    <w:p>
-      <w:pPr>
-        <w:pStyle w:val="PargrafodaLista"/>
-        <w:numPr>
-          <w:ilvl w:val="1"/>
-          <w:numId w:val="1"/>
-        </w:numPr>
-        <w:tabs>
-          <w:tab w:val="left" w:pos="860"/>
-        </w:tabs>
-        <w:spacing w:line="281" w:lineRule="exact"/>
-        <w:ind w:left="860" w:hanging="359"/>
-        <w:rPr>
-          <w:sz w:val="24"/>
-        </w:rPr>
-      </w:pPr>
-      <w:r>
-        <w:rPr>
-          <w:sz w:val="24"/>
-        </w:rPr>
-        <w:t>Business</w:t>
-      </w:r>
-      <w:r>
-        <w:rPr>
-          <w:spacing w:val="51"/>
-          <w:sz w:val="24"/>
-        </w:rPr>
-        <w:t xml:space="preserve"> </w:t>
-      </w:r>
-      <w:r>
-        <w:rPr>
-          <w:spacing w:val="-2"/>
-          <w:sz w:val="24"/>
-        </w:rPr>
-        <w:t>Intelligence</w:t>
-      </w:r>
-    </w:p>
-    <w:p>
-      <w:pPr>
-        <w:pStyle w:val="PargrafodaLista"/>
-        <w:numPr>
-          <w:ilvl w:val="1"/>
-          <w:numId w:val="1"/>
-        </w:numPr>
+        <w:t>Render (Backend)</w:t>
+      </w:r>
+    </w:p>
+    <w:p>
+      <w:pPr>
         <w:tabs>
           <w:tab w:val="left" w:pos="860"/>
         </w:tabs>
         <w:spacing w:line="301" w:lineRule="exact"/>
-        <w:ind w:left="860" w:hanging="359"/>
-        <w:rPr>
-          <w:sz w:val="24"/>
-        </w:rPr>
-      </w:pPr>
-      <w:r>
-        <w:rPr>
-          <w:sz w:val="24"/>
-        </w:rPr>
-        <w:t>Big</w:t>
-      </w:r>
-      <w:r>
-        <w:rPr>
-          <w:spacing w:val="10"/>
-          <w:sz w:val="24"/>
-        </w:rPr>
-        <w:t xml:space="preserve"> </w:t>
-      </w:r>
-      <w:r>
-        <w:rPr>
-          <w:spacing w:val="-4"/>
-          <w:sz w:val="24"/>
-        </w:rPr>
-        <w:t>Data</w:t>
-      </w:r>
+        <w:ind w:left="501"/>
+        <w:rPr>
+          <w:sz w:val="24"/>
+        </w:rPr>
+      </w:pPr>
     </w:p>
     <w:sectPr>
       <w:pgSz w:w="11910" w:h="16840"/>
@@ -21905,7 +21533,7 @@
         </mc:Choice>
         <mc:Fallback>
           <w:pict>
-            <v:group w14:anchorId="495FE5DA" id="Group 2" o:spid="_x0000_s1026" style="position:absolute;margin-left:56.65pt;margin-top:789.35pt;width:482.4pt;height:1.95pt;z-index:-16330752;mso-wrap-distance-left:0;mso-wrap-distance-right:0;mso-position-horizontal-relative:page;mso-position-vertical-relative:page" coordsize="61264,247" o:gfxdata="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">
+            <v:group w14:anchorId="14502645" id="Group 2" o:spid="_x0000_s1026" style="position:absolute;margin-left:56.65pt;margin-top:789.35pt;width:482.4pt;height:1.95pt;z-index:-16330752;mso-wrap-distance-left:0;mso-wrap-distance-right:0;mso-position-horizontal-relative:page;mso-position-vertical-relative:page" coordsize="61264,247" o:gfxdata="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">
               <v:shape id="Graphic 3" o:spid="_x0000_s1027" style="position:absolute;width:61233;height:215;visibility:visible;mso-wrap-style:square;v-text-anchor:top" coordsize="6123305,21590" o:gfxdata="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" path="m6123305,l,,,21590r6123305,l6123305,xe" fillcolor="#9f9f9f" stroked="f">
                 <v:path arrowok="t"/>
               </v:shape>
@@ -23952,6 +23580,204 @@
         <w:sz w:val="20"/>
       </w:rPr>
       <mc:AlternateContent>
+        <mc:Choice Requires="wps">
+          <w:drawing>
+            <wp:anchor distT="0" distB="0" distL="0" distR="0" simplePos="0" relativeHeight="486991360" behindDoc="1" locked="0" layoutInCell="1" allowOverlap="1" wp14:anchorId="7970A03C" wp14:editId="2E8C7F11">
+              <wp:simplePos x="0" y="0"/>
+              <wp:positionH relativeFrom="page">
+                <wp:posOffset>6060961</wp:posOffset>
+              </wp:positionH>
+              <wp:positionV relativeFrom="page">
+                <wp:posOffset>10092055</wp:posOffset>
+              </wp:positionV>
+              <wp:extent cx="567055" cy="153670"/>
+              <wp:effectExtent l="0" t="0" r="0" b="0"/>
+              <wp:wrapNone/>
+              <wp:docPr id="47" name="Textbox 47"/>
+              <wp:cNvGraphicFramePr>
+                <a:graphicFrameLocks xmlns:a="http://schemas.openxmlformats.org/drawingml/2006/main"/>
+              </wp:cNvGraphicFramePr>
+              <a:graphic xmlns:a="http://schemas.openxmlformats.org/drawingml/2006/main">
+                <a:graphicData uri="http://schemas.microsoft.com/office/word/2010/wordprocessingShape">
+                  <wps:wsp>
+                    <wps:cNvSpPr txBox="1">
+                      <a:spLocks/>
+                    </wps:cNvSpPr>
+                    <wps:spPr>
+                      <a:xfrm>
+                        <a:off x="0" y="0"/>
+                        <a:ext cx="567055" cy="153670"/>
+                      </a:xfrm>
+                      <a:prstGeom prst="rect">
+                        <a:avLst/>
+                      </a:prstGeom>
+                    </wps:spPr>
+                    <wps:txbx>
+                      <w:txbxContent>
+                        <w:p>
+                          <w:pPr>
+                            <w:spacing w:line="225" w:lineRule="exact"/>
+                            <w:ind w:left="20"/>
+                            <w:rPr>
+                              <w:rFonts w:ascii="Calibri" w:hAnsi="Calibri"/>
+                              <w:sz w:val="20"/>
+                            </w:rPr>
+                          </w:pPr>
+                          <w:r>
+                            <w:rPr>
+                              <w:rFonts w:ascii="Calibri" w:hAnsi="Calibri"/>
+                              <w:sz w:val="20"/>
+                            </w:rPr>
+                            <w:t>Página</w:t>
+                          </w:r>
+                          <w:r>
+                            <w:rPr>
+                              <w:rFonts w:ascii="Calibri" w:hAnsi="Calibri"/>
+                              <w:spacing w:val="-1"/>
+                              <w:sz w:val="20"/>
+                            </w:rPr>
+                            <w:t xml:space="preserve"> </w:t>
+                          </w:r>
+                          <w:r>
+                            <w:rPr>
+                              <w:rFonts w:ascii="Calibri" w:hAnsi="Calibri"/>
+                              <w:spacing w:val="-7"/>
+                              <w:sz w:val="20"/>
+                            </w:rPr>
+                            <w:fldChar w:fldCharType="begin"/>
+                          </w:r>
+                          <w:r>
+                            <w:rPr>
+                              <w:rFonts w:ascii="Calibri" w:hAnsi="Calibri"/>
+                              <w:spacing w:val="-7"/>
+                              <w:sz w:val="20"/>
+                            </w:rPr>
+                            <w:instrText xml:space="preserve"> PAGE </w:instrText>
+                          </w:r>
+                          <w:r>
+                            <w:rPr>
+                              <w:rFonts w:ascii="Calibri" w:hAnsi="Calibri"/>
+                              <w:spacing w:val="-7"/>
+                              <w:sz w:val="20"/>
+                            </w:rPr>
+                            <w:fldChar w:fldCharType="separate"/>
+                          </w:r>
+                          <w:r>
+                            <w:rPr>
+                              <w:rFonts w:ascii="Calibri" w:hAnsi="Calibri"/>
+                              <w:spacing w:val="-7"/>
+                              <w:sz w:val="20"/>
+                            </w:rPr>
+                            <w:t>10</w:t>
+                          </w:r>
+                          <w:r>
+                            <w:rPr>
+                              <w:rFonts w:ascii="Calibri" w:hAnsi="Calibri"/>
+                              <w:spacing w:val="-7"/>
+                              <w:sz w:val="20"/>
+                            </w:rPr>
+                            <w:fldChar w:fldCharType="end"/>
+                          </w:r>
+                        </w:p>
+                      </w:txbxContent>
+                    </wps:txbx>
+                    <wps:bodyPr wrap="square" lIns="0" tIns="0" rIns="0" bIns="0" rtlCol="0">
+                      <a:noAutofit/>
+                    </wps:bodyPr>
+                  </wps:wsp>
+                </a:graphicData>
+              </a:graphic>
+            </wp:anchor>
+          </w:drawing>
+        </mc:Choice>
+        <mc:Fallback>
+          <w:pict>
+            <v:shapetype w14:anchorId="7970A03C" id="_x0000_t202" coordsize="21600,21600" o:spt="202" path="m,l,21600r21600,l21600,xe">
+              <v:stroke joinstyle="miter"/>
+              <v:path gradientshapeok="t" o:connecttype="rect"/>
+            </v:shapetype>
+            <v:shape id="Textbox 47" o:spid="_x0000_s1034" type="#_x0000_t202" style="position:absolute;margin-left:477.25pt;margin-top:794.65pt;width:44.65pt;height:12.1pt;z-index:-16325120;visibility:visible;mso-wrap-style:square;mso-wrap-distance-left:0;mso-wrap-distance-top:0;mso-wrap-distance-right:0;mso-wrap-distance-bottom:0;mso-position-horizontal:absolute;mso-position-horizontal-relative:page;mso-position-vertical:absolute;mso-position-vertical-relative:page;v-text-anchor:top" o:gfxdata="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" filled="f" stroked="f">
+              <v:textbox inset="0,0,0,0">
+                <w:txbxContent>
+                  <w:p>
+                    <w:pPr>
+                      <w:spacing w:line="225" w:lineRule="exact"/>
+                      <w:ind w:left="20"/>
+                      <w:rPr>
+                        <w:rFonts w:ascii="Calibri" w:hAnsi="Calibri"/>
+                        <w:sz w:val="20"/>
+                      </w:rPr>
+                    </w:pPr>
+                    <w:r>
+                      <w:rPr>
+                        <w:rFonts w:ascii="Calibri" w:hAnsi="Calibri"/>
+                        <w:sz w:val="20"/>
+                      </w:rPr>
+                      <w:t>Página</w:t>
+                    </w:r>
+                    <w:r>
+                      <w:rPr>
+                        <w:rFonts w:ascii="Calibri" w:hAnsi="Calibri"/>
+                        <w:spacing w:val="-1"/>
+                        <w:sz w:val="20"/>
+                      </w:rPr>
+                      <w:t xml:space="preserve"> </w:t>
+                    </w:r>
+                    <w:r>
+                      <w:rPr>
+                        <w:rFonts w:ascii="Calibri" w:hAnsi="Calibri"/>
+                        <w:spacing w:val="-7"/>
+                        <w:sz w:val="20"/>
+                      </w:rPr>
+                      <w:fldChar w:fldCharType="begin"/>
+                    </w:r>
+                    <w:r>
+                      <w:rPr>
+                        <w:rFonts w:ascii="Calibri" w:hAnsi="Calibri"/>
+                        <w:spacing w:val="-7"/>
+                        <w:sz w:val="20"/>
+                      </w:rPr>
+                      <w:instrText xml:space="preserve"> PAGE </w:instrText>
+                    </w:r>
+                    <w:r>
+                      <w:rPr>
+                        <w:rFonts w:ascii="Calibri" w:hAnsi="Calibri"/>
+                        <w:spacing w:val="-7"/>
+                        <w:sz w:val="20"/>
+                      </w:rPr>
+                      <w:fldChar w:fldCharType="separate"/>
+                    </w:r>
+                    <w:r>
+                      <w:rPr>
+                        <w:rFonts w:ascii="Calibri" w:hAnsi="Calibri"/>
+                        <w:spacing w:val="-7"/>
+                        <w:sz w:val="20"/>
+                      </w:rPr>
+                      <w:t>10</w:t>
+                    </w:r>
+                    <w:r>
+                      <w:rPr>
+                        <w:rFonts w:ascii="Calibri" w:hAnsi="Calibri"/>
+                        <w:spacing w:val="-7"/>
+                        <w:sz w:val="20"/>
+                      </w:rPr>
+                      <w:fldChar w:fldCharType="end"/>
+                    </w:r>
+                  </w:p>
+                </w:txbxContent>
+              </v:textbox>
+              <w10:wrap anchorx="page" anchory="page"/>
+            </v:shape>
+          </w:pict>
+        </mc:Fallback>
+      </mc:AlternateContent>
+    </w:r>
+    <w:r>
+      <w:rPr>
+        <w:noProof/>
+        <w:sz w:val="20"/>
+      </w:rPr>
+      <mc:AlternateContent>
         <mc:Choice Requires="wpg">
           <w:drawing>
             <wp:anchor distT="0" distB="0" distL="0" distR="0" simplePos="0" relativeHeight="486990336" behindDoc="1" locked="0" layoutInCell="1" allowOverlap="1" wp14:anchorId="7EA817D8" wp14:editId="11A7A4B2">
@@ -24309,7 +24135,7 @@
         </mc:Choice>
         <mc:Fallback>
           <w:pict>
-            <v:group w14:anchorId="4321DBB5" id="Group 39" o:spid="_x0000_s1026" style="position:absolute;margin-left:56.65pt;margin-top:789.35pt;width:482.4pt;height:1.95pt;z-index:-16326144;mso-wrap-distance-left:0;mso-wrap-distance-right:0;mso-position-horizontal-relative:page;mso-position-vertical-relative:page" coordsize="61264,247" o:gfxdata="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">
+            <v:group w14:anchorId="0D5F8DA8" id="Group 39" o:spid="_x0000_s1026" style="position:absolute;margin-left:56.65pt;margin-top:789.35pt;width:482.4pt;height:1.95pt;z-index:-16326144;mso-wrap-distance-left:0;mso-wrap-distance-right:0;mso-position-horizontal-relative:page;mso-position-vertical-relative:page" coordsize="61264,247" o:gfxdata="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">
               <v:shape id="Graphic 40" o:spid="_x0000_s1027" style="position:absolute;width:61233;height:215;visibility:visible;mso-wrap-style:square;v-text-anchor:top" coordsize="6123305,21590" o:gfxdata="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" path="m6123305,l,,,21590r6123305,l6123305,xe" fillcolor="#9f9f9f" stroked="f">
                 <v:path arrowok="t"/>
               </v:shape>
@@ -24342,7 +24168,7 @@
       <mc:AlternateContent>
         <mc:Choice Requires="wps">
           <w:drawing>
-            <wp:anchor distT="0" distB="0" distL="0" distR="0" simplePos="0" relativeHeight="486990848" behindDoc="1" locked="0" layoutInCell="1" allowOverlap="1" wp14:anchorId="6765FCFB" wp14:editId="4EA70B7D">
+            <wp:anchor distT="0" distB="0" distL="0" distR="0" simplePos="0" relativeHeight="486990848" behindDoc="1" locked="0" layoutInCell="1" allowOverlap="1" wp14:anchorId="6765FCFB" wp14:editId="3B80D362">
               <wp:simplePos x="0" y="0"/>
               <wp:positionH relativeFrom="page">
                 <wp:posOffset>978204</wp:posOffset>
@@ -24525,11 +24351,7 @@
         </mc:Choice>
         <mc:Fallback>
           <w:pict>
-            <v:shapetype w14:anchorId="6765FCFB" id="_x0000_t202" coordsize="21600,21600" o:spt="202" path="m,l,21600r21600,l21600,xe">
-              <v:stroke joinstyle="miter"/>
-              <v:path gradientshapeok="t" o:connecttype="rect"/>
-            </v:shapetype>
-            <v:shape id="Textbox 46" o:spid="_x0000_s1034" type="#_x0000_t202" style="position:absolute;margin-left:77pt;margin-top:794.7pt;width:222.25pt;height:12.1pt;z-index:-16325632;visibility:visible;mso-wrap-style:square;mso-wrap-distance-left:0;mso-wrap-distance-top:0;mso-wrap-distance-right:0;mso-wrap-distance-bottom:0;mso-position-horizontal:absolute;mso-position-horizontal-relative:page;mso-position-vertical:absolute;mso-position-vertical-relative:page;v-text-anchor:top" o:gfxdata="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" filled="f" stroked="f">
+            <v:shape w14:anchorId="6765FCFB" id="Textbox 46" o:spid="_x0000_s1035" type="#_x0000_t202" style="position:absolute;margin-left:77pt;margin-top:794.7pt;width:222.25pt;height:12.1pt;z-index:-16325632;visibility:visible;mso-wrap-style:square;mso-wrap-distance-left:0;mso-wrap-distance-top:0;mso-wrap-distance-right:0;mso-wrap-distance-bottom:0;mso-position-horizontal:absolute;mso-position-horizontal-relative:page;mso-position-vertical:absolute;mso-position-vertical-relative:page;v-text-anchor:top" o:gfxdata="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" filled="f" stroked="f">
               <v:textbox inset="0,0,0,0">
                 <w:txbxContent>
                   <w:p>
@@ -24668,200 +24490,6 @@
                         <w:sz w:val="20"/>
                       </w:rPr>
                       <w:t>IIII</w:t>
-                    </w:r>
-                  </w:p>
-                </w:txbxContent>
-              </v:textbox>
-              <w10:wrap anchorx="page" anchory="page"/>
-            </v:shape>
-          </w:pict>
-        </mc:Fallback>
-      </mc:AlternateContent>
-    </w:r>
-    <w:r>
-      <w:rPr>
-        <w:noProof/>
-        <w:sz w:val="20"/>
-      </w:rPr>
-      <mc:AlternateContent>
-        <mc:Choice Requires="wps">
-          <w:drawing>
-            <wp:anchor distT="0" distB="0" distL="0" distR="0" simplePos="0" relativeHeight="486991360" behindDoc="1" locked="0" layoutInCell="1" allowOverlap="1" wp14:anchorId="7970A03C" wp14:editId="70C0183A">
-              <wp:simplePos x="0" y="0"/>
-              <wp:positionH relativeFrom="page">
-                <wp:posOffset>6061328</wp:posOffset>
-              </wp:positionH>
-              <wp:positionV relativeFrom="page">
-                <wp:posOffset>10092638</wp:posOffset>
-              </wp:positionV>
-              <wp:extent cx="567055" cy="153670"/>
-              <wp:effectExtent l="0" t="0" r="0" b="0"/>
-              <wp:wrapNone/>
-              <wp:docPr id="47" name="Textbox 47"/>
-              <wp:cNvGraphicFramePr>
-                <a:graphicFrameLocks xmlns:a="http://schemas.openxmlformats.org/drawingml/2006/main"/>
-              </wp:cNvGraphicFramePr>
-              <a:graphic xmlns:a="http://schemas.openxmlformats.org/drawingml/2006/main">
-                <a:graphicData uri="http://schemas.microsoft.com/office/word/2010/wordprocessingShape">
-                  <wps:wsp>
-                    <wps:cNvSpPr txBox="1">
-                      <a:spLocks/>
-                    </wps:cNvSpPr>
-                    <wps:spPr>
-                      <a:xfrm>
-                        <a:off x="0" y="0"/>
-                        <a:ext cx="567055" cy="153670"/>
-                      </a:xfrm>
-                      <a:prstGeom prst="rect">
-                        <a:avLst/>
-                      </a:prstGeom>
-                    </wps:spPr>
-                    <wps:txbx>
-                      <w:txbxContent>
-                        <w:p>
-                          <w:pPr>
-                            <w:spacing w:line="225" w:lineRule="exact"/>
-                            <w:ind w:left="20"/>
-                            <w:rPr>
-                              <w:rFonts w:ascii="Calibri" w:hAnsi="Calibri"/>
-                              <w:sz w:val="20"/>
-                            </w:rPr>
-                          </w:pPr>
-                          <w:r>
-                            <w:rPr>
-                              <w:rFonts w:ascii="Calibri" w:hAnsi="Calibri"/>
-                              <w:sz w:val="20"/>
-                            </w:rPr>
-                            <w:t>Página</w:t>
-                          </w:r>
-                          <w:r>
-                            <w:rPr>
-                              <w:rFonts w:ascii="Calibri" w:hAnsi="Calibri"/>
-                              <w:spacing w:val="-1"/>
-                              <w:sz w:val="20"/>
-                            </w:rPr>
-                            <w:t xml:space="preserve"> </w:t>
-                          </w:r>
-                          <w:r>
-                            <w:rPr>
-                              <w:rFonts w:ascii="Calibri" w:hAnsi="Calibri"/>
-                              <w:spacing w:val="-7"/>
-                              <w:sz w:val="20"/>
-                            </w:rPr>
-                            <w:fldChar w:fldCharType="begin"/>
-                          </w:r>
-                          <w:r>
-                            <w:rPr>
-                              <w:rFonts w:ascii="Calibri" w:hAnsi="Calibri"/>
-                              <w:spacing w:val="-7"/>
-                              <w:sz w:val="20"/>
-                            </w:rPr>
-                            <w:instrText xml:space="preserve"> PAGE </w:instrText>
-                          </w:r>
-                          <w:r>
-                            <w:rPr>
-                              <w:rFonts w:ascii="Calibri" w:hAnsi="Calibri"/>
-                              <w:spacing w:val="-7"/>
-                              <w:sz w:val="20"/>
-                            </w:rPr>
-                            <w:fldChar w:fldCharType="separate"/>
-                          </w:r>
-                          <w:r>
-                            <w:rPr>
-                              <w:rFonts w:ascii="Calibri" w:hAnsi="Calibri"/>
-                              <w:spacing w:val="-7"/>
-                              <w:sz w:val="20"/>
-                            </w:rPr>
-                            <w:t>10</w:t>
-                          </w:r>
-                          <w:r>
-                            <w:rPr>
-                              <w:rFonts w:ascii="Calibri" w:hAnsi="Calibri"/>
-                              <w:spacing w:val="-7"/>
-                              <w:sz w:val="20"/>
-                            </w:rPr>
-                            <w:fldChar w:fldCharType="end"/>
-                          </w:r>
-                        </w:p>
-                      </w:txbxContent>
-                    </wps:txbx>
-                    <wps:bodyPr wrap="square" lIns="0" tIns="0" rIns="0" bIns="0" rtlCol="0">
-                      <a:noAutofit/>
-                    </wps:bodyPr>
-                  </wps:wsp>
-                </a:graphicData>
-              </a:graphic>
-            </wp:anchor>
-          </w:drawing>
-        </mc:Choice>
-        <mc:Fallback>
-          <w:pict>
-            <v:shape w14:anchorId="7970A03C" id="Textbox 47" o:spid="_x0000_s1035" type="#_x0000_t202" style="position:absolute;margin-left:477.25pt;margin-top:794.7pt;width:44.65pt;height:12.1pt;z-index:-16325120;visibility:visible;mso-wrap-style:square;mso-wrap-distance-left:0;mso-wrap-distance-top:0;mso-wrap-distance-right:0;mso-wrap-distance-bottom:0;mso-position-horizontal:absolute;mso-position-horizontal-relative:page;mso-position-vertical:absolute;mso-position-vertical-relative:page;v-text-anchor:top" o:gfxdata="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" filled="f" stroked="f">
-              <v:textbox inset="0,0,0,0">
-                <w:txbxContent>
-                  <w:p>
-                    <w:pPr>
-                      <w:spacing w:line="225" w:lineRule="exact"/>
-                      <w:ind w:left="20"/>
-                      <w:rPr>
-                        <w:rFonts w:ascii="Calibri" w:hAnsi="Calibri"/>
-                        <w:sz w:val="20"/>
-                      </w:rPr>
-                    </w:pPr>
-                    <w:r>
-                      <w:rPr>
-                        <w:rFonts w:ascii="Calibri" w:hAnsi="Calibri"/>
-                        <w:sz w:val="20"/>
-                      </w:rPr>
-                      <w:t>Página</w:t>
-                    </w:r>
-                    <w:r>
-                      <w:rPr>
-                        <w:rFonts w:ascii="Calibri" w:hAnsi="Calibri"/>
-                        <w:spacing w:val="-1"/>
-                        <w:sz w:val="20"/>
-                      </w:rPr>
-                      <w:t xml:space="preserve"> </w:t>
-                    </w:r>
-                    <w:r>
-                      <w:rPr>
-                        <w:rFonts w:ascii="Calibri" w:hAnsi="Calibri"/>
-                        <w:spacing w:val="-7"/>
-                        <w:sz w:val="20"/>
-                      </w:rPr>
-                      <w:fldChar w:fldCharType="begin"/>
-                    </w:r>
-                    <w:r>
-                      <w:rPr>
-                        <w:rFonts w:ascii="Calibri" w:hAnsi="Calibri"/>
-                        <w:spacing w:val="-7"/>
-                        <w:sz w:val="20"/>
-                      </w:rPr>
-                      <w:instrText xml:space="preserve"> PAGE </w:instrText>
-                    </w:r>
-                    <w:r>
-                      <w:rPr>
-                        <w:rFonts w:ascii="Calibri" w:hAnsi="Calibri"/>
-                        <w:spacing w:val="-7"/>
-                        <w:sz w:val="20"/>
-                      </w:rPr>
-                      <w:fldChar w:fldCharType="separate"/>
-                    </w:r>
-                    <w:r>
-                      <w:rPr>
-                        <w:rFonts w:ascii="Calibri" w:hAnsi="Calibri"/>
-                        <w:spacing w:val="-7"/>
-                        <w:sz w:val="20"/>
-                      </w:rPr>
-                      <w:t>10</w:t>
-                    </w:r>
-                    <w:r>
-                      <w:rPr>
-                        <w:rFonts w:ascii="Calibri" w:hAnsi="Calibri"/>
-                        <w:spacing w:val="-7"/>
-                        <w:sz w:val="20"/>
-                      </w:rPr>
-                      <w:fldChar w:fldCharType="end"/>
                     </w:r>
                   </w:p>
                 </w:txbxContent>
@@ -25737,7 +25365,7 @@
         </mc:Choice>
         <mc:Fallback>
           <w:pict>
-            <v:group w14:anchorId="7DA16E0F" id="Group 59" o:spid="_x0000_s1026" style="position:absolute;margin-left:56.65pt;margin-top:789.35pt;width:482.4pt;height:1.95pt;z-index:-16323584;mso-wrap-distance-left:0;mso-wrap-distance-right:0;mso-position-horizontal-relative:page;mso-position-vertical-relative:page" coordsize="61264,247" o:gfxdata="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">
+            <v:group w14:anchorId="2105D289" id="Group 59" o:spid="_x0000_s1026" style="position:absolute;margin-left:56.65pt;margin-top:789.35pt;width:482.4pt;height:1.95pt;z-index:-16323584;mso-wrap-distance-left:0;mso-wrap-distance-right:0;mso-position-horizontal-relative:page;mso-position-vertical-relative:page" coordsize="61264,247" o:gfxdata="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">
               <v:shape id="Graphic 60" o:spid="_x0000_s1027" style="position:absolute;width:61233;height:215;visibility:visible;mso-wrap-style:square;v-text-anchor:top" coordsize="6123305,21590" o:gfxdata="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" path="m6123305,l,,,21590r6123305,l6123305,xe" fillcolor="#9f9f9f" stroked="f">
                 <v:path arrowok="t"/>
               </v:shape>
@@ -26352,7 +25980,6 @@
       <w:lvlJc w:val="left"/>
       <w:pPr>
         <w:ind w:left="1581" w:hanging="846"/>
-        <w:jc w:val="left"/>
       </w:pPr>
       <w:rPr>
         <w:rFonts w:hint="default"/>
@@ -27138,6 +26765,52 @@
       <w:szCs w:val="24"/>
     </w:rPr>
   </w:style>
+  <w:style w:type="paragraph" w:styleId="Ttulo3">
+    <w:name w:val="heading 3"/>
+    <w:basedOn w:val="Normal"/>
+    <w:next w:val="Normal"/>
+    <w:link w:val="Ttulo3Char"/>
+    <w:uiPriority w:val="9"/>
+    <w:semiHidden/>
+    <w:unhideWhenUsed/>
+    <w:qFormat/>
+    <w:rsid w:val="002D051C"/>
+    <w:pPr>
+      <w:keepNext/>
+      <w:keepLines/>
+      <w:spacing w:before="40"/>
+      <w:outlineLvl w:val="2"/>
+    </w:pPr>
+    <w:rPr>
+      <w:rFonts w:asciiTheme="majorHAnsi" w:eastAsiaTheme="majorEastAsia" w:hAnsiTheme="majorHAnsi" w:cstheme="majorBidi"/>
+      <w:color w:val="243F60" w:themeColor="accent1" w:themeShade="7F"/>
+      <w:sz w:val="24"/>
+      <w:szCs w:val="24"/>
+    </w:rPr>
+  </w:style>
+  <w:style w:type="paragraph" w:styleId="Ttulo4">
+    <w:name w:val="heading 4"/>
+    <w:basedOn w:val="Normal"/>
+    <w:next w:val="Normal"/>
+    <w:link w:val="Ttulo4Char"/>
+    <w:uiPriority w:val="9"/>
+    <w:semiHidden/>
+    <w:unhideWhenUsed/>
+    <w:qFormat/>
+    <w:rsid w:val="002D051C"/>
+    <w:pPr>
+      <w:keepNext/>
+      <w:keepLines/>
+      <w:spacing w:before="40"/>
+      <w:outlineLvl w:val="3"/>
+    </w:pPr>
+    <w:rPr>
+      <w:rFonts w:asciiTheme="majorHAnsi" w:eastAsiaTheme="majorEastAsia" w:hAnsiTheme="majorHAnsi" w:cstheme="majorBidi"/>
+      <w:i/>
+      <w:iCs/>
+      <w:color w:val="365F91" w:themeColor="accent1" w:themeShade="BF"/>
+    </w:rPr>
+  </w:style>
   <w:style w:type="character" w:default="1" w:styleId="Fontepargpadro">
     <w:name w:val="Default Paragraph Font"/>
     <w:uiPriority w:val="1"/>
@@ -27209,6 +26882,109 @@
       <w:spacing w:before="81"/>
       <w:ind w:left="100"/>
     </w:pPr>
+  </w:style>
+  <w:style w:type="character" w:styleId="Hyperlink">
+    <w:name w:val="Hyperlink"/>
+    <w:basedOn w:val="Fontepargpadro"/>
+    <w:uiPriority w:val="99"/>
+    <w:unhideWhenUsed/>
+    <w:rsid w:val="00F424A2"/>
+    <w:rPr>
+      <w:color w:val="0000FF" w:themeColor="hyperlink"/>
+      <w:u w:val="single"/>
+    </w:rPr>
+  </w:style>
+  <w:style w:type="character" w:styleId="MenoPendente">
+    <w:name w:val="Unresolved Mention"/>
+    <w:basedOn w:val="Fontepargpadro"/>
+    <w:uiPriority w:val="99"/>
+    <w:semiHidden/>
+    <w:unhideWhenUsed/>
+    <w:rsid w:val="00F424A2"/>
+    <w:rPr>
+      <w:color w:val="605E5C"/>
+      <w:shd w:val="clear" w:color="auto" w:fill="E1DFDD"/>
+    </w:rPr>
+  </w:style>
+  <w:style w:type="character" w:customStyle="1" w:styleId="Ttulo3Char">
+    <w:name w:val="Título 3 Char"/>
+    <w:basedOn w:val="Fontepargpadro"/>
+    <w:link w:val="Ttulo3"/>
+    <w:uiPriority w:val="9"/>
+    <w:semiHidden/>
+    <w:rsid w:val="002D051C"/>
+    <w:rPr>
+      <w:rFonts w:asciiTheme="majorHAnsi" w:eastAsiaTheme="majorEastAsia" w:hAnsiTheme="majorHAnsi" w:cstheme="majorBidi"/>
+      <w:color w:val="243F60" w:themeColor="accent1" w:themeShade="7F"/>
+      <w:sz w:val="24"/>
+      <w:szCs w:val="24"/>
+      <w:lang w:val="pt-PT"/>
+    </w:rPr>
+  </w:style>
+  <w:style w:type="character" w:customStyle="1" w:styleId="Ttulo4Char">
+    <w:name w:val="Título 4 Char"/>
+    <w:basedOn w:val="Fontepargpadro"/>
+    <w:link w:val="Ttulo4"/>
+    <w:uiPriority w:val="9"/>
+    <w:semiHidden/>
+    <w:rsid w:val="002D051C"/>
+    <w:rPr>
+      <w:rFonts w:asciiTheme="majorHAnsi" w:eastAsiaTheme="majorEastAsia" w:hAnsiTheme="majorHAnsi" w:cstheme="majorBidi"/>
+      <w:i/>
+      <w:iCs/>
+      <w:color w:val="365F91" w:themeColor="accent1" w:themeShade="BF"/>
+      <w:lang w:val="pt-PT"/>
+    </w:rPr>
+  </w:style>
+  <w:style w:type="paragraph" w:styleId="Cabealho">
+    <w:name w:val="header"/>
+    <w:basedOn w:val="Normal"/>
+    <w:link w:val="CabealhoChar"/>
+    <w:uiPriority w:val="99"/>
+    <w:unhideWhenUsed/>
+    <w:rsid w:val="00E222EC"/>
+    <w:pPr>
+      <w:tabs>
+        <w:tab w:val="center" w:pos="4252"/>
+        <w:tab w:val="right" w:pos="8504"/>
+      </w:tabs>
+    </w:pPr>
+  </w:style>
+  <w:style w:type="character" w:customStyle="1" w:styleId="CabealhoChar">
+    <w:name w:val="Cabeçalho Char"/>
+    <w:basedOn w:val="Fontepargpadro"/>
+    <w:link w:val="Cabealho"/>
+    <w:uiPriority w:val="99"/>
+    <w:rsid w:val="00E222EC"/>
+    <w:rPr>
+      <w:rFonts w:ascii="Tahoma" w:eastAsia="Tahoma" w:hAnsi="Tahoma" w:cs="Tahoma"/>
+      <w:lang w:val="pt-PT"/>
+    </w:rPr>
+  </w:style>
+  <w:style w:type="paragraph" w:styleId="Rodap">
+    <w:name w:val="footer"/>
+    <w:basedOn w:val="Normal"/>
+    <w:link w:val="RodapChar"/>
+    <w:uiPriority w:val="99"/>
+    <w:unhideWhenUsed/>
+    <w:rsid w:val="00E222EC"/>
+    <w:pPr>
+      <w:tabs>
+        <w:tab w:val="center" w:pos="4252"/>
+        <w:tab w:val="right" w:pos="8504"/>
+      </w:tabs>
+    </w:pPr>
+  </w:style>
+  <w:style w:type="character" w:customStyle="1" w:styleId="RodapChar">
+    <w:name w:val="Rodapé Char"/>
+    <w:basedOn w:val="Fontepargpadro"/>
+    <w:link w:val="Rodap"/>
+    <w:uiPriority w:val="99"/>
+    <w:rsid w:val="00E222EC"/>
+    <w:rPr>
+      <w:rFonts w:ascii="Tahoma" w:eastAsia="Tahoma" w:hAnsi="Tahoma" w:cs="Tahoma"/>
+      <w:lang w:val="pt-PT"/>
+    </w:rPr>
   </w:style>
 </w:styles>
 </file>

</xml_diff>